<commit_message>
Implementar ranking, administración de usuarios y documentación final
</commit_message>
<xml_diff>
--- a/docs/Tayron Salas - Documentacion Proyecto#1 - Avance 1.docx
+++ b/docs/Tayron Salas - Documentacion Proyecto#1 - Avance 1.docx
@@ -1,6 +1,6 @@
 
 <file path=word/document.xml><?xml version="1.0" encoding="utf-8"?>
-<w:document xmlns:wpc="http://schemas.microsoft.com/office/word/2010/wordprocessingCanvas" xmlns:cx="http://schemas.microsoft.com/office/drawing/2014/chartex" xmlns:cx1="http://schemas.microsoft.com/office/drawing/2015/9/8/chartex" xmlns:cx2="http://schemas.microsoft.com/office/drawing/2015/10/21/chartex" xmlns:cx3="http://schemas.microsoft.com/office/drawing/2016/5/9/chartex" xmlns:cx4="http://schemas.microsoft.com/office/drawing/2016/5/10/chartex" xmlns:cx5="http://schemas.microsoft.com/office/drawing/2016/5/11/chartex" xmlns:cx6="http://schemas.microsoft.com/office/drawing/2016/5/12/chartex" xmlns:cx7="http://schemas.microsoft.com/office/drawing/2016/5/13/chartex" xmlns:cx8="http://schemas.microsoft.com/office/drawing/2016/5/14/chartex" xmlns:mc="http://schemas.openxmlformats.org/markup-compatibility/2006" xmlns:aink="http://schemas.microsoft.com/office/drawing/2016/ink" xmlns:am3d="http://schemas.microsoft.com/office/drawing/2017/model3d" xmlns:o="urn:schemas-microsoft-com:office:office" xmlns:oel="http://schemas.microsoft.com/office/2019/extlst" xmlns:r="http://schemas.openxmlformats.org/officeDocument/2006/relationships" xmlns:m="http://schemas.openxmlformats.org/officeDocument/2006/math" xmlns:v="urn:schemas-microsoft-com:vml" xmlns:wp14="http://schemas.microsoft.com/office/word/2010/wordprocessingDrawing" xmlns:wp="http://schemas.openxmlformats.org/drawingml/2006/wordprocessingDrawing" xmlns:w10="urn:schemas-microsoft-com:office:word" xmlns:w="http://schemas.openxmlformats.org/wordprocessingml/2006/main" xmlns:w14="http://schemas.microsoft.com/office/word/2010/wordml" xmlns:w15="http://schemas.microsoft.com/office/word/2012/wordml" xmlns:w16cex="http://schemas.microsoft.com/office/word/2018/wordml/cex" xmlns:w16cid="http://schemas.microsoft.com/office/word/2016/wordml/cid" xmlns:w16="http://schemas.microsoft.com/office/word/2018/wordml" xmlns:w16du="http://schemas.microsoft.com/office/word/2023/wordml/word16du" xmlns:w16sdtdh="http://schemas.microsoft.com/office/word/2020/wordml/sdtdatahash" xmlns:w16sdtfl="http://schemas.microsoft.com/office/word/2024/wordml/sdtformatlock" xmlns:w16se="http://schemas.microsoft.com/office/word/2015/wordml/symex" xmlns:wpg="http://schemas.microsoft.com/office/word/2010/wordprocessingGroup" xmlns:wpi="http://schemas.microsoft.com/office/word/2010/wordprocessingInk" xmlns:wne="http://schemas.microsoft.com/office/word/2006/wordml" xmlns:wps="http://schemas.microsoft.com/office/word/2010/wordprocessingShape" mc:Ignorable="w14 w15 w16se w16cid w16 w16cex w16sdtdh w16sdtfl w16du wp14">
+<w:document xmlns:wpc="http://schemas.microsoft.com/office/word/2010/wordprocessingCanvas" xmlns:cx="http://schemas.microsoft.com/office/drawing/2014/chartex" xmlns:cx1="http://schemas.microsoft.com/office/drawing/2015/9/8/chartex" xmlns:cx2="http://schemas.microsoft.com/office/drawing/2015/10/21/chartex" xmlns:cx3="http://schemas.microsoft.com/office/drawing/2016/5/9/chartex" xmlns:cx4="http://schemas.microsoft.com/office/drawing/2016/5/10/chartex" xmlns:cx5="http://schemas.microsoft.com/office/drawing/2016/5/11/chartex" xmlns:cx6="http://schemas.microsoft.com/office/drawing/2016/5/12/chartex" xmlns:cx7="http://schemas.microsoft.com/office/drawing/2016/5/13/chartex" xmlns:cx8="http://schemas.microsoft.com/office/drawing/2016/5/14/chartex" xmlns:mc="http://schemas.openxmlformats.org/markup-compatibility/2006" xmlns:aink="http://schemas.microsoft.com/office/drawing/2016/ink" xmlns:am3d="http://schemas.microsoft.com/office/drawing/2017/model3d" xmlns:o="urn:schemas-microsoft-com:office:office" xmlns:oel="http://schemas.microsoft.com/office/2019/extlst" xmlns:r="http://schemas.openxmlformats.org/officeDocument/2006/relationships" xmlns:m="http://schemas.openxmlformats.org/officeDocument/2006/math" xmlns:v="urn:schemas-microsoft-com:vml" xmlns:wp14="http://schemas.microsoft.com/office/word/2010/wordprocessingDrawing" xmlns:wp="http://schemas.openxmlformats.org/drawingml/2006/wordprocessingDrawing" xmlns:w10="urn:schemas-microsoft-com:office:word" xmlns:w="http://schemas.openxmlformats.org/wordprocessingml/2006/main" xmlns:w14="http://schemas.microsoft.com/office/word/2010/wordml" xmlns:w15="http://schemas.microsoft.com/office/word/2012/wordml" xmlns:w16cei="http://schemas.microsoft.com/office/word/2026/wordml/cei" xmlns:w16cex="http://schemas.microsoft.com/office/word/2018/wordml/cex" xmlns:w16cid="http://schemas.microsoft.com/office/word/2016/wordml/cid" xmlns:w16="http://schemas.microsoft.com/office/word/2018/wordml" xmlns:w16du="http://schemas.microsoft.com/office/word/2023/wordml/word16du" xmlns:w16sdtdh="http://schemas.microsoft.com/office/word/2020/wordml/sdtdatahash" xmlns:w16sdtfl="http://schemas.microsoft.com/office/word/2024/wordml/sdtformatlock" xmlns:w16se="http://schemas.microsoft.com/office/word/2015/wordml/symex" xmlns:wpg="http://schemas.microsoft.com/office/word/2010/wordprocessingGroup" xmlns:wpi="http://schemas.microsoft.com/office/word/2010/wordprocessingInk" xmlns:wne="http://schemas.microsoft.com/office/word/2006/wordml" xmlns:wps="http://schemas.microsoft.com/office/word/2010/wordprocessingShape" mc:Ignorable="w14 w15 w16se w16cid w16 w16cex w16sdtdh w16sdtfl w16du wp14">
   <w:body>
     <w:p>
       <w:pPr>
@@ -727,7 +727,7 @@
           <w:r>
             <w:fldChar w:fldCharType="separate"/>
           </w:r>
-          <w:hyperlink w:anchor="_Toc234107127" w:history="1">
+          <w:hyperlink w:anchor="_Toc236079931" w:history="1">
             <w:r>
               <w:rPr>
                 <w:rStyle w:val="Hipervnculo"/>
@@ -754,7 +754,7 @@
                 <w:noProof/>
                 <w:webHidden/>
               </w:rPr>
-              <w:instrText xml:space="preserve"> PAGEREF _Toc234107127 \h </w:instrText>
+              <w:instrText xml:space="preserve"> PAGEREF _Toc236079931 \h </w:instrText>
             </w:r>
             <w:r>
               <w:rPr>
@@ -801,7 +801,7 @@
               <w14:ligatures w14:val="standardContextual"/>
             </w:rPr>
           </w:pPr>
-          <w:hyperlink w:anchor="_Toc234107128" w:history="1">
+          <w:hyperlink w:anchor="_Toc236079932" w:history="1">
             <w:r>
               <w:rPr>
                 <w:rStyle w:val="Hipervnculo"/>
@@ -828,7 +828,7 @@
                 <w:noProof/>
                 <w:webHidden/>
               </w:rPr>
-              <w:instrText xml:space="preserve"> PAGEREF _Toc234107128 \h </w:instrText>
+              <w:instrText xml:space="preserve"> PAGEREF _Toc236079932 \h </w:instrText>
             </w:r>
             <w:r>
               <w:rPr>
@@ -875,7 +875,7 @@
               <w14:ligatures w14:val="standardContextual"/>
             </w:rPr>
           </w:pPr>
-          <w:hyperlink w:anchor="_Toc234107129" w:history="1">
+          <w:hyperlink w:anchor="_Toc236079933" w:history="1">
             <w:r>
               <w:rPr>
                 <w:rStyle w:val="Hipervnculo"/>
@@ -902,7 +902,7 @@
                 <w:noProof/>
                 <w:webHidden/>
               </w:rPr>
-              <w:instrText xml:space="preserve"> PAGEREF _Toc234107129 \h </w:instrText>
+              <w:instrText xml:space="preserve"> PAGEREF _Toc236079933 \h </w:instrText>
             </w:r>
             <w:r>
               <w:rPr>
@@ -949,7 +949,7 @@
               <w14:ligatures w14:val="standardContextual"/>
             </w:rPr>
           </w:pPr>
-          <w:hyperlink w:anchor="_Toc234107130" w:history="1">
+          <w:hyperlink w:anchor="_Toc236079934" w:history="1">
             <w:r>
               <w:rPr>
                 <w:rStyle w:val="Hipervnculo"/>
@@ -976,7 +976,7 @@
                 <w:noProof/>
                 <w:webHidden/>
               </w:rPr>
-              <w:instrText xml:space="preserve"> PAGEREF _Toc234107130 \h </w:instrText>
+              <w:instrText xml:space="preserve"> PAGEREF _Toc236079934 \h </w:instrText>
             </w:r>
             <w:r>
               <w:rPr>
@@ -1023,7 +1023,7 @@
               <w14:ligatures w14:val="standardContextual"/>
             </w:rPr>
           </w:pPr>
-          <w:hyperlink w:anchor="_Toc234107131" w:history="1">
+          <w:hyperlink w:anchor="_Toc236079935" w:history="1">
             <w:r>
               <w:rPr>
                 <w:rStyle w:val="Hipervnculo"/>
@@ -1050,7 +1050,7 @@
                 <w:noProof/>
                 <w:webHidden/>
               </w:rPr>
-              <w:instrText xml:space="preserve"> PAGEREF _Toc234107131 \h </w:instrText>
+              <w:instrText xml:space="preserve"> PAGEREF _Toc236079935 \h </w:instrText>
             </w:r>
             <w:r>
               <w:rPr>
@@ -1097,7 +1097,7 @@
               <w14:ligatures w14:val="standardContextual"/>
             </w:rPr>
           </w:pPr>
-          <w:hyperlink w:anchor="_Toc234107132" w:history="1">
+          <w:hyperlink w:anchor="_Toc236079936" w:history="1">
             <w:r>
               <w:rPr>
                 <w:rStyle w:val="Hipervnculo"/>
@@ -1124,7 +1124,7 @@
                 <w:noProof/>
                 <w:webHidden/>
               </w:rPr>
-              <w:instrText xml:space="preserve"> PAGEREF _Toc234107132 \h </w:instrText>
+              <w:instrText xml:space="preserve"> PAGEREF _Toc236079936 \h </w:instrText>
             </w:r>
             <w:r>
               <w:rPr>
@@ -1171,7 +1171,7 @@
               <w14:ligatures w14:val="standardContextual"/>
             </w:rPr>
           </w:pPr>
-          <w:hyperlink w:anchor="_Toc234107133" w:history="1">
+          <w:hyperlink w:anchor="_Toc236079937" w:history="1">
             <w:r>
               <w:rPr>
                 <w:rStyle w:val="Hipervnculo"/>
@@ -1198,7 +1198,7 @@
                 <w:noProof/>
                 <w:webHidden/>
               </w:rPr>
-              <w:instrText xml:space="preserve"> PAGEREF _Toc234107133 \h </w:instrText>
+              <w:instrText xml:space="preserve"> PAGEREF _Toc236079937 \h </w:instrText>
             </w:r>
             <w:r>
               <w:rPr>
@@ -1245,7 +1245,7 @@
               <w14:ligatures w14:val="standardContextual"/>
             </w:rPr>
           </w:pPr>
-          <w:hyperlink w:anchor="_Toc234107134" w:history="1">
+          <w:hyperlink w:anchor="_Toc236079938" w:history="1">
             <w:r>
               <w:rPr>
                 <w:rStyle w:val="Hipervnculo"/>
@@ -1272,7 +1272,7 @@
                 <w:noProof/>
                 <w:webHidden/>
               </w:rPr>
-              <w:instrText xml:space="preserve"> PAGEREF _Toc234107134 \h </w:instrText>
+              <w:instrText xml:space="preserve"> PAGEREF _Toc236079938 \h </w:instrText>
             </w:r>
             <w:r>
               <w:rPr>
@@ -1319,7 +1319,7 @@
               <w14:ligatures w14:val="standardContextual"/>
             </w:rPr>
           </w:pPr>
-          <w:hyperlink w:anchor="_Toc234107135" w:history="1">
+          <w:hyperlink w:anchor="_Toc236079939" w:history="1">
             <w:r>
               <w:rPr>
                 <w:rStyle w:val="Hipervnculo"/>
@@ -1346,7 +1346,7 @@
                 <w:noProof/>
                 <w:webHidden/>
               </w:rPr>
-              <w:instrText xml:space="preserve"> PAGEREF _Toc234107135 \h </w:instrText>
+              <w:instrText xml:space="preserve"> PAGEREF _Toc236079939 \h </w:instrText>
             </w:r>
             <w:r>
               <w:rPr>
@@ -1393,7 +1393,7 @@
               <w14:ligatures w14:val="standardContextual"/>
             </w:rPr>
           </w:pPr>
-          <w:hyperlink w:anchor="_Toc234107136" w:history="1">
+          <w:hyperlink w:anchor="_Toc236079940" w:history="1">
             <w:r>
               <w:rPr>
                 <w:rStyle w:val="Hipervnculo"/>
@@ -1420,7 +1420,7 @@
                 <w:noProof/>
                 <w:webHidden/>
               </w:rPr>
-              <w:instrText xml:space="preserve"> PAGEREF _Toc234107136 \h </w:instrText>
+              <w:instrText xml:space="preserve"> PAGEREF _Toc236079940 \h </w:instrText>
             </w:r>
             <w:r>
               <w:rPr>
@@ -1467,7 +1467,7 @@
               <w14:ligatures w14:val="standardContextual"/>
             </w:rPr>
           </w:pPr>
-          <w:hyperlink w:anchor="_Toc234107137" w:history="1">
+          <w:hyperlink w:anchor="_Toc236079941" w:history="1">
             <w:r>
               <w:rPr>
                 <w:rStyle w:val="Hipervnculo"/>
@@ -1494,7 +1494,7 @@
                 <w:noProof/>
                 <w:webHidden/>
               </w:rPr>
-              <w:instrText xml:space="preserve"> PAGEREF _Toc234107137 \h </w:instrText>
+              <w:instrText xml:space="preserve"> PAGEREF _Toc236079941 \h </w:instrText>
             </w:r>
             <w:r>
               <w:rPr>
@@ -1541,7 +1541,7 @@
               <w14:ligatures w14:val="standardContextual"/>
             </w:rPr>
           </w:pPr>
-          <w:hyperlink w:anchor="_Toc234107138" w:history="1">
+          <w:hyperlink w:anchor="_Toc236079942" w:history="1">
             <w:r>
               <w:rPr>
                 <w:rStyle w:val="Hipervnculo"/>
@@ -1568,7 +1568,7 @@
                 <w:noProof/>
                 <w:webHidden/>
               </w:rPr>
-              <w:instrText xml:space="preserve"> PAGEREF _Toc234107138 \h </w:instrText>
+              <w:instrText xml:space="preserve"> PAGEREF _Toc236079942 \h </w:instrText>
             </w:r>
             <w:r>
               <w:rPr>
@@ -1615,12 +1615,12 @@
               <w14:ligatures w14:val="standardContextual"/>
             </w:rPr>
           </w:pPr>
-          <w:hyperlink w:anchor="_Toc234107139" w:history="1">
+          <w:hyperlink w:anchor="_Toc236079943" w:history="1">
             <w:r>
               <w:rPr>
                 <w:rStyle w:val="Hipervnculo"/>
                 <w:noProof/>
-                <w:lang w:val="en-US"/>
+                <w:lang w:val="es-CR"/>
               </w:rPr>
               <w:t>7.2 Features</w:t>
             </w:r>
@@ -1643,7 +1643,7 @@
                 <w:noProof/>
                 <w:webHidden/>
               </w:rPr>
-              <w:instrText xml:space="preserve"> PAGEREF _Toc234107139 \h </w:instrText>
+              <w:instrText xml:space="preserve"> PAGEREF _Toc236079943 \h </w:instrText>
             </w:r>
             <w:r>
               <w:rPr>
@@ -1690,7 +1690,7 @@
               <w14:ligatures w14:val="standardContextual"/>
             </w:rPr>
           </w:pPr>
-          <w:hyperlink w:anchor="_Toc234107140" w:history="1">
+          <w:hyperlink w:anchor="_Toc236079944" w:history="1">
             <w:r>
               <w:rPr>
                 <w:rStyle w:val="Hipervnculo"/>
@@ -1718,7 +1718,7 @@
                 <w:noProof/>
                 <w:webHidden/>
               </w:rPr>
-              <w:instrText xml:space="preserve"> PAGEREF _Toc234107140 \h </w:instrText>
+              <w:instrText xml:space="preserve"> PAGEREF _Toc236079944 \h </w:instrText>
             </w:r>
             <w:r>
               <w:rPr>
@@ -1765,7 +1765,7 @@
               <w14:ligatures w14:val="standardContextual"/>
             </w:rPr>
           </w:pPr>
-          <w:hyperlink w:anchor="_Toc234107141" w:history="1">
+          <w:hyperlink w:anchor="_Toc236079945" w:history="1">
             <w:r>
               <w:rPr>
                 <w:rStyle w:val="Hipervnculo"/>
@@ -1792,7 +1792,7 @@
                 <w:noProof/>
                 <w:webHidden/>
               </w:rPr>
-              <w:instrText xml:space="preserve"> PAGEREF _Toc234107141 \h </w:instrText>
+              <w:instrText xml:space="preserve"> PAGEREF _Toc236079945 \h </w:instrText>
             </w:r>
             <w:r>
               <w:rPr>
@@ -1839,7 +1839,7 @@
               <w14:ligatures w14:val="standardContextual"/>
             </w:rPr>
           </w:pPr>
-          <w:hyperlink w:anchor="_Toc234107142" w:history="1">
+          <w:hyperlink w:anchor="_Toc236079946" w:history="1">
             <w:r>
               <w:rPr>
                 <w:rStyle w:val="Hipervnculo"/>
@@ -1866,7 +1866,7 @@
                 <w:noProof/>
                 <w:webHidden/>
               </w:rPr>
-              <w:instrText xml:space="preserve"> PAGEREF _Toc234107142 \h </w:instrText>
+              <w:instrText xml:space="preserve"> PAGEREF _Toc236079946 \h </w:instrText>
             </w:r>
             <w:r>
               <w:rPr>
@@ -1913,7 +1913,7 @@
               <w14:ligatures w14:val="standardContextual"/>
             </w:rPr>
           </w:pPr>
-          <w:hyperlink w:anchor="_Toc234107143" w:history="1">
+          <w:hyperlink w:anchor="_Toc236079947" w:history="1">
             <w:r>
               <w:rPr>
                 <w:rStyle w:val="Hipervnculo"/>
@@ -1941,7 +1941,7 @@
                 <w:noProof/>
                 <w:webHidden/>
               </w:rPr>
-              <w:instrText xml:space="preserve"> PAGEREF _Toc234107143 \h </w:instrText>
+              <w:instrText xml:space="preserve"> PAGEREF _Toc236079947 \h </w:instrText>
             </w:r>
             <w:r>
               <w:rPr>
@@ -1988,12 +1988,12 @@
               <w14:ligatures w14:val="standardContextual"/>
             </w:rPr>
           </w:pPr>
-          <w:hyperlink w:anchor="_Toc234107144" w:history="1">
+          <w:hyperlink w:anchor="_Toc236079948" w:history="1">
             <w:r>
               <w:rPr>
                 <w:rStyle w:val="Hipervnculo"/>
                 <w:noProof/>
-                <w:lang w:val="en-US"/>
+                <w:lang w:val="es-CR"/>
               </w:rPr>
               <w:t>9.2 GitHub</w:t>
             </w:r>
@@ -2016,7 +2016,7 @@
                 <w:noProof/>
                 <w:webHidden/>
               </w:rPr>
-              <w:instrText xml:space="preserve"> PAGEREF _Toc234107144 \h </w:instrText>
+              <w:instrText xml:space="preserve"> PAGEREF _Toc236079948 \h </w:instrText>
             </w:r>
             <w:r>
               <w:rPr>
@@ -2063,7 +2063,7 @@
               <w14:ligatures w14:val="standardContextual"/>
             </w:rPr>
           </w:pPr>
-          <w:hyperlink w:anchor="_Toc234107145" w:history="1">
+          <w:hyperlink w:anchor="_Toc236079949" w:history="1">
             <w:r>
               <w:rPr>
                 <w:rStyle w:val="Hipervnculo"/>
@@ -2090,7 +2090,7 @@
                 <w:noProof/>
                 <w:webHidden/>
               </w:rPr>
-              <w:instrText xml:space="preserve"> PAGEREF _Toc234107145 \h </w:instrText>
+              <w:instrText xml:space="preserve"> PAGEREF _Toc236079949 \h </w:instrText>
             </w:r>
             <w:r>
               <w:rPr>
@@ -2137,7 +2137,7 @@
               <w14:ligatures w14:val="standardContextual"/>
             </w:rPr>
           </w:pPr>
-          <w:hyperlink w:anchor="_Toc234107146" w:history="1">
+          <w:hyperlink w:anchor="_Toc236079950" w:history="1">
             <w:r>
               <w:rPr>
                 <w:rStyle w:val="Hipervnculo"/>
@@ -2164,7 +2164,7 @@
                 <w:noProof/>
                 <w:webHidden/>
               </w:rPr>
-              <w:instrText xml:space="preserve"> PAGEREF _Toc234107146 \h </w:instrText>
+              <w:instrText xml:space="preserve"> PAGEREF _Toc236079950 \h </w:instrText>
             </w:r>
             <w:r>
               <w:rPr>
@@ -2429,7 +2429,7 @@
       <w:pPr>
         <w:pStyle w:val="Ttulo1"/>
       </w:pPr>
-      <w:bookmarkStart w:id="0" w:name="_Toc234107127"/>
+      <w:bookmarkStart w:id="0" w:name="_Toc236079931"/>
       <w:r>
         <w:lastRenderedPageBreak/>
         <w:t>1. Introducción</w:t>
@@ -2611,7 +2611,7 @@
       <w:pPr>
         <w:pStyle w:val="Ttulo1"/>
       </w:pPr>
-      <w:bookmarkStart w:id="1" w:name="_Toc234107128"/>
+      <w:bookmarkStart w:id="1" w:name="_Toc236079932"/>
       <w:r>
         <w:t>2. Objetivos</w:t>
       </w:r>
@@ -2622,7 +2622,7 @@
       <w:pPr>
         <w:pStyle w:val="Ttulo2"/>
       </w:pPr>
-      <w:bookmarkStart w:id="2" w:name="_Toc234107129"/>
+      <w:bookmarkStart w:id="2" w:name="_Toc236079933"/>
       <w:r>
         <w:t>2.1 Objetivo General</w:t>
       </w:r>
@@ -2678,12 +2678,9 @@
       <w:pPr>
         <w:pStyle w:val="Ttulo2"/>
       </w:pPr>
-      <w:bookmarkStart w:id="3" w:name="_Toc234107130"/>
-      <w:r>
-        <w:t xml:space="preserve">2.2 </w:t>
-      </w:r>
-      <w:r>
-        <w:t>Objetivos Específicos</w:t>
+      <w:bookmarkStart w:id="3" w:name="_Toc236079934"/>
+      <w:r>
+        <w:t>2.2 Objetivos Específicos</w:t>
       </w:r>
       <w:bookmarkEnd w:id="3"/>
     </w:p>
@@ -2957,7 +2954,7 @@
       <w:pPr>
         <w:pStyle w:val="Ttulo1"/>
       </w:pPr>
-      <w:bookmarkStart w:id="4" w:name="_Toc234107131"/>
+      <w:bookmarkStart w:id="4" w:name="_Toc236079935"/>
       <w:r>
         <w:lastRenderedPageBreak/>
         <w:t xml:space="preserve">3. </w:t>
@@ -3061,7 +3058,7 @@
       <w:pPr>
         <w:pStyle w:val="Ttulo1"/>
       </w:pPr>
-      <w:bookmarkStart w:id="5" w:name="_Toc234107132"/>
+      <w:bookmarkStart w:id="5" w:name="_Toc236079936"/>
       <w:r>
         <w:t>4</w:t>
       </w:r>
@@ -3124,12 +3121,9 @@
       <w:pPr>
         <w:pStyle w:val="Ttulo2"/>
       </w:pPr>
-      <w:bookmarkStart w:id="6" w:name="_Toc234107133"/>
-      <w:r>
-        <w:t>4</w:t>
-      </w:r>
-      <w:r>
-        <w:t xml:space="preserve">.1 </w:t>
+      <w:bookmarkStart w:id="6" w:name="_Toc236079937"/>
+      <w:r>
+        <w:t xml:space="preserve">4.1 </w:t>
       </w:r>
       <w:r>
         <w:t>Arquitectura Modelo Vista Controlador (MVC)</w:t>
@@ -3194,18 +3188,9 @@
       <w:pPr>
         <w:pStyle w:val="Ttulo2"/>
       </w:pPr>
-      <w:bookmarkStart w:id="7" w:name="_Toc234107134"/>
-      <w:r>
-        <w:t>4.</w:t>
-      </w:r>
-      <w:r>
-        <w:t>2</w:t>
-      </w:r>
-      <w:r>
-        <w:t xml:space="preserve"> </w:t>
-      </w:r>
-      <w:r>
-        <w:t>Diagrama UML Inicial</w:t>
+      <w:bookmarkStart w:id="7" w:name="_Toc236079938"/>
+      <w:r>
+        <w:t>4.2 Diagrama UML Inicial</w:t>
       </w:r>
       <w:bookmarkEnd w:id="7"/>
     </w:p>
@@ -3253,6 +3238,7 @@
       <w:r>
         <w:rPr>
           <w:rFonts w:ascii="Arial" w:hAnsi="Arial" w:cs="Arial"/>
+          <w:noProof/>
         </w:rPr>
         <w:drawing>
           <wp:inline distT="0" distB="0" distL="0" distR="0" wp14:anchorId="689D57E7" wp14:editId="77422CC1">
@@ -3341,7 +3327,7 @@
         <w:rPr>
           <w:rFonts w:ascii="Arial" w:hAnsi="Arial" w:cs="Arial"/>
         </w:rPr>
-        <w:t>Un usuario puede pertenecer a una o varias quinielas.</w:t>
+        <w:t>Un usuario puede registrar varios pronósticos.</w:t>
       </w:r>
     </w:p>
     <w:p>
@@ -3359,24 +3345,6 @@
         <w:rPr>
           <w:rFonts w:ascii="Arial" w:hAnsi="Arial" w:cs="Arial"/>
         </w:rPr>
-        <w:t>Un usuario puede registrar varios pronósticos.</w:t>
-      </w:r>
-    </w:p>
-    <w:p>
-      <w:pPr>
-        <w:pStyle w:val="Prrafodelista"/>
-        <w:numPr>
-          <w:ilvl w:val="0"/>
-          <w:numId w:val="11"/>
-        </w:numPr>
-        <w:rPr>
-          <w:rFonts w:ascii="Arial" w:hAnsi="Arial" w:cs="Arial"/>
-        </w:rPr>
-      </w:pPr>
-      <w:r>
-        <w:rPr>
-          <w:rFonts w:ascii="Arial" w:hAnsi="Arial" w:cs="Arial"/>
-        </w:rPr>
         <w:t>Un partido puede contener múltiples pronósticos.</w:t>
       </w:r>
     </w:p>
@@ -3391,7 +3359,7 @@
       <w:pPr>
         <w:pStyle w:val="Ttulo1"/>
       </w:pPr>
-      <w:bookmarkStart w:id="8" w:name="_Toc234107135"/>
+      <w:bookmarkStart w:id="8" w:name="_Toc236079939"/>
       <w:r>
         <w:t>5</w:t>
       </w:r>
@@ -3592,7 +3560,7 @@
       <w:pPr>
         <w:pStyle w:val="Ttulo1"/>
       </w:pPr>
-      <w:bookmarkStart w:id="9" w:name="_Toc234107136"/>
+      <w:bookmarkStart w:id="9" w:name="_Toc236079940"/>
       <w:r>
         <w:t>6</w:t>
       </w:r>
@@ -4057,7 +4025,7 @@
       <w:pPr>
         <w:pStyle w:val="Ttulo1"/>
       </w:pPr>
-      <w:bookmarkStart w:id="10" w:name="_Toc234107137"/>
+      <w:bookmarkStart w:id="10" w:name="_Toc236079941"/>
       <w:r>
         <w:t>7</w:t>
       </w:r>
@@ -4080,15 +4048,9 @@
       <w:pPr>
         <w:pStyle w:val="Ttulo2"/>
       </w:pPr>
-      <w:bookmarkStart w:id="11" w:name="_Toc234107138"/>
-      <w:r>
-        <w:t>7.1</w:t>
-      </w:r>
-      <w:r>
-        <w:t xml:space="preserve"> </w:t>
-      </w:r>
-      <w:r>
-        <w:t>Epic</w:t>
+      <w:bookmarkStart w:id="11" w:name="_Toc236079942"/>
+      <w:r>
+        <w:t>7.1 Epic</w:t>
       </w:r>
       <w:bookmarkEnd w:id="11"/>
     </w:p>
@@ -4131,375 +4093,372 @@
       <w:pPr>
         <w:pStyle w:val="Ttulo2"/>
         <w:rPr>
+          <w:lang w:val="es-CR"/>
+        </w:rPr>
+      </w:pPr>
+      <w:bookmarkStart w:id="12" w:name="_Toc236079943"/>
+      <w:r>
+        <w:rPr>
+          <w:lang w:val="es-CR"/>
+        </w:rPr>
+        <w:t xml:space="preserve">7.2 </w:t>
+      </w:r>
+      <w:proofErr w:type="spellStart"/>
+      <w:r>
+        <w:rPr>
+          <w:lang w:val="es-CR"/>
+        </w:rPr>
+        <w:t>Features</w:t>
+      </w:r>
+      <w:bookmarkEnd w:id="12"/>
+      <w:proofErr w:type="spellEnd"/>
+    </w:p>
+    <w:p>
+      <w:pPr>
+        <w:rPr>
+          <w:lang w:val="es-CR"/>
+        </w:rPr>
+      </w:pPr>
+    </w:p>
+    <w:p>
+      <w:pPr>
+        <w:rPr>
+          <w:rFonts w:ascii="Arial" w:hAnsi="Arial" w:cs="Arial"/>
+          <w:lang w:val="es-CR"/>
+        </w:rPr>
+      </w:pPr>
+      <w:proofErr w:type="spellStart"/>
+      <w:r>
+        <w:rPr>
+          <w:rFonts w:ascii="Arial" w:hAnsi="Arial" w:cs="Arial"/>
+          <w:lang w:val="es-CR"/>
+        </w:rPr>
+        <w:t>Feature</w:t>
+      </w:r>
+      <w:proofErr w:type="spellEnd"/>
+      <w:r>
+        <w:rPr>
+          <w:rFonts w:ascii="Arial" w:hAnsi="Arial" w:cs="Arial"/>
+          <w:lang w:val="es-CR"/>
+        </w:rPr>
+        <w:t xml:space="preserve"> 1</w:t>
+      </w:r>
+      <w:r>
+        <w:rPr>
+          <w:rFonts w:ascii="Arial" w:hAnsi="Arial" w:cs="Arial"/>
+          <w:lang w:val="es-CR"/>
+        </w:rPr>
+        <w:t xml:space="preserve"> - </w:t>
+      </w:r>
+      <w:r>
+        <w:rPr>
+          <w:rFonts w:ascii="Arial" w:hAnsi="Arial" w:cs="Arial"/>
+          <w:lang w:val="es-CR"/>
+        </w:rPr>
+        <w:t>Gestión de Usuarios</w:t>
+      </w:r>
+    </w:p>
+    <w:p>
+      <w:pPr>
+        <w:rPr>
+          <w:rFonts w:ascii="Arial" w:hAnsi="Arial" w:cs="Arial"/>
+          <w:lang w:val="es-CR"/>
+        </w:rPr>
+      </w:pPr>
+    </w:p>
+    <w:p>
+      <w:pPr>
+        <w:rPr>
+          <w:rFonts w:ascii="Arial" w:hAnsi="Arial" w:cs="Arial"/>
+          <w:lang w:val="es-CR"/>
+        </w:rPr>
+      </w:pPr>
+      <w:proofErr w:type="spellStart"/>
+      <w:r>
+        <w:rPr>
+          <w:rFonts w:ascii="Arial" w:hAnsi="Arial" w:cs="Arial"/>
+          <w:lang w:val="es-CR"/>
+        </w:rPr>
+        <w:t>Feature</w:t>
+      </w:r>
+      <w:proofErr w:type="spellEnd"/>
+      <w:r>
+        <w:rPr>
+          <w:rFonts w:ascii="Arial" w:hAnsi="Arial" w:cs="Arial"/>
+          <w:lang w:val="es-CR"/>
+        </w:rPr>
+        <w:t xml:space="preserve"> 2</w:t>
+      </w:r>
+      <w:r>
+        <w:rPr>
+          <w:rFonts w:ascii="Arial" w:hAnsi="Arial" w:cs="Arial"/>
+          <w:lang w:val="es-CR"/>
+        </w:rPr>
+        <w:t xml:space="preserve"> - </w:t>
+      </w:r>
+      <w:r>
+        <w:rPr>
+          <w:rFonts w:ascii="Arial" w:hAnsi="Arial" w:cs="Arial"/>
+          <w:lang w:val="es-CR"/>
+        </w:rPr>
+        <w:t>Gestión de Partidos</w:t>
+      </w:r>
+    </w:p>
+    <w:p>
+      <w:pPr>
+        <w:rPr>
+          <w:rFonts w:ascii="Arial" w:hAnsi="Arial" w:cs="Arial"/>
+          <w:lang w:val="es-CR"/>
+        </w:rPr>
+      </w:pPr>
+    </w:p>
+    <w:p>
+      <w:pPr>
+        <w:rPr>
+          <w:rFonts w:ascii="Arial" w:hAnsi="Arial" w:cs="Arial"/>
+          <w:lang w:val="es-CR"/>
+        </w:rPr>
+      </w:pPr>
+      <w:proofErr w:type="spellStart"/>
+      <w:r>
+        <w:rPr>
+          <w:rFonts w:ascii="Arial" w:hAnsi="Arial" w:cs="Arial"/>
+          <w:lang w:val="es-CR"/>
+        </w:rPr>
+        <w:t>Feature</w:t>
+      </w:r>
+      <w:proofErr w:type="spellEnd"/>
+      <w:r>
+        <w:rPr>
+          <w:rFonts w:ascii="Arial" w:hAnsi="Arial" w:cs="Arial"/>
+          <w:lang w:val="es-CR"/>
+        </w:rPr>
+        <w:t xml:space="preserve"> 3</w:t>
+      </w:r>
+      <w:r>
+        <w:rPr>
+          <w:rFonts w:ascii="Arial" w:hAnsi="Arial" w:cs="Arial"/>
+          <w:lang w:val="es-CR"/>
+        </w:rPr>
+        <w:t xml:space="preserve"> - </w:t>
+      </w:r>
+      <w:r>
+        <w:rPr>
+          <w:rFonts w:ascii="Arial" w:hAnsi="Arial" w:cs="Arial"/>
+          <w:lang w:val="es-CR"/>
+        </w:rPr>
+        <w:t>Gestión de Pronósticos</w:t>
+      </w:r>
+    </w:p>
+    <w:p>
+      <w:pPr>
+        <w:rPr>
+          <w:rFonts w:ascii="Arial" w:hAnsi="Arial" w:cs="Arial"/>
+          <w:lang w:val="es-CR"/>
+        </w:rPr>
+      </w:pPr>
+    </w:p>
+    <w:p>
+      <w:pPr>
+        <w:rPr>
+          <w:rFonts w:ascii="Arial" w:hAnsi="Arial" w:cs="Arial"/>
+          <w:lang w:val="es-CR"/>
+        </w:rPr>
+      </w:pPr>
+      <w:proofErr w:type="spellStart"/>
+      <w:r>
+        <w:rPr>
+          <w:rFonts w:ascii="Arial" w:hAnsi="Arial" w:cs="Arial"/>
+          <w:lang w:val="es-CR"/>
+        </w:rPr>
+        <w:t>Feature</w:t>
+      </w:r>
+      <w:proofErr w:type="spellEnd"/>
+      <w:r>
+        <w:rPr>
+          <w:rFonts w:ascii="Arial" w:hAnsi="Arial" w:cs="Arial"/>
+          <w:lang w:val="es-CR"/>
+        </w:rPr>
+        <w:t xml:space="preserve"> 4</w:t>
+      </w:r>
+      <w:r>
+        <w:rPr>
+          <w:rFonts w:ascii="Arial" w:hAnsi="Arial" w:cs="Arial"/>
+          <w:lang w:val="es-CR"/>
+        </w:rPr>
+        <w:t xml:space="preserve"> - </w:t>
+      </w:r>
+      <w:r>
+        <w:rPr>
+          <w:rFonts w:ascii="Arial" w:hAnsi="Arial" w:cs="Arial"/>
+          <w:lang w:val="es-CR"/>
+        </w:rPr>
+        <w:t>Gestión de Quinielas</w:t>
+      </w:r>
+    </w:p>
+    <w:p>
+      <w:pPr>
+        <w:rPr>
+          <w:rFonts w:ascii="Arial" w:hAnsi="Arial" w:cs="Arial"/>
+          <w:lang w:val="es-CR"/>
+        </w:rPr>
+      </w:pPr>
+    </w:p>
+    <w:p>
+      <w:pPr>
+        <w:rPr>
+          <w:rFonts w:ascii="Arial" w:hAnsi="Arial" w:cs="Arial"/>
+          <w:lang w:val="es-CR"/>
+        </w:rPr>
+      </w:pPr>
+      <w:proofErr w:type="spellStart"/>
+      <w:r>
+        <w:rPr>
+          <w:rFonts w:ascii="Arial" w:hAnsi="Arial" w:cs="Arial"/>
+          <w:lang w:val="es-CR"/>
+        </w:rPr>
+        <w:t>Feature</w:t>
+      </w:r>
+      <w:proofErr w:type="spellEnd"/>
+      <w:r>
+        <w:rPr>
+          <w:rFonts w:ascii="Arial" w:hAnsi="Arial" w:cs="Arial"/>
+          <w:lang w:val="es-CR"/>
+        </w:rPr>
+        <w:t xml:space="preserve"> 5</w:t>
+      </w:r>
+      <w:r>
+        <w:rPr>
+          <w:rFonts w:ascii="Arial" w:hAnsi="Arial" w:cs="Arial"/>
+          <w:lang w:val="es-CR"/>
+        </w:rPr>
+        <w:t xml:space="preserve"> - </w:t>
+      </w:r>
+      <w:r>
+        <w:rPr>
+          <w:rFonts w:ascii="Arial" w:hAnsi="Arial" w:cs="Arial"/>
+          <w:lang w:val="es-CR"/>
+        </w:rPr>
+        <w:t>Rankings y Estadísticas</w:t>
+      </w:r>
+    </w:p>
+    <w:p>
+      <w:pPr>
+        <w:rPr>
+          <w:rFonts w:ascii="Arial" w:hAnsi="Arial" w:cs="Arial"/>
+          <w:lang w:val="es-CR"/>
+        </w:rPr>
+      </w:pPr>
+    </w:p>
+    <w:p>
+      <w:pPr>
+        <w:rPr>
+          <w:rFonts w:ascii="Arial" w:hAnsi="Arial" w:cs="Arial"/>
+          <w:lang w:val="es-CR"/>
+        </w:rPr>
+      </w:pPr>
+      <w:proofErr w:type="spellStart"/>
+      <w:r>
+        <w:rPr>
+          <w:rFonts w:ascii="Arial" w:hAnsi="Arial" w:cs="Arial"/>
+          <w:lang w:val="es-CR"/>
+        </w:rPr>
+        <w:t>Feature</w:t>
+      </w:r>
+      <w:proofErr w:type="spellEnd"/>
+      <w:r>
+        <w:rPr>
+          <w:rFonts w:ascii="Arial" w:hAnsi="Arial" w:cs="Arial"/>
+          <w:lang w:val="es-CR"/>
+        </w:rPr>
+        <w:t xml:space="preserve"> 6</w:t>
+      </w:r>
+      <w:r>
+        <w:rPr>
+          <w:rFonts w:ascii="Arial" w:hAnsi="Arial" w:cs="Arial"/>
+          <w:lang w:val="es-CR"/>
+        </w:rPr>
+        <w:t xml:space="preserve"> - </w:t>
+      </w:r>
+      <w:r>
+        <w:rPr>
+          <w:rFonts w:ascii="Arial" w:hAnsi="Arial" w:cs="Arial"/>
+          <w:lang w:val="es-CR"/>
+        </w:rPr>
+        <w:t>Interfaz y Persistencia de Datos</w:t>
+      </w:r>
+    </w:p>
+    <w:p>
+      <w:pPr>
+        <w:rPr>
+          <w:rFonts w:ascii="Arial" w:hAnsi="Arial" w:cs="Arial"/>
+        </w:rPr>
+      </w:pPr>
+    </w:p>
+    <w:p>
+      <w:pPr>
+        <w:rPr>
+          <w:rFonts w:ascii="Arial" w:hAnsi="Arial" w:cs="Arial"/>
+        </w:rPr>
+      </w:pPr>
+    </w:p>
+    <w:p>
+      <w:pPr>
+        <w:rPr>
+          <w:rFonts w:ascii="Arial" w:hAnsi="Arial" w:cs="Arial"/>
+        </w:rPr>
+      </w:pPr>
+    </w:p>
+    <w:p>
+      <w:pPr>
+        <w:rPr>
+          <w:rFonts w:ascii="Arial" w:hAnsi="Arial" w:cs="Arial"/>
+        </w:rPr>
+      </w:pPr>
+    </w:p>
+    <w:p>
+      <w:pPr>
+        <w:rPr>
+          <w:rFonts w:ascii="Arial" w:hAnsi="Arial" w:cs="Arial"/>
+        </w:rPr>
+      </w:pPr>
+    </w:p>
+    <w:p>
+      <w:pPr>
+        <w:rPr>
+          <w:rFonts w:ascii="Arial" w:hAnsi="Arial" w:cs="Arial"/>
+        </w:rPr>
+      </w:pPr>
+    </w:p>
+    <w:p>
+      <w:pPr>
+        <w:rPr>
+          <w:rFonts w:ascii="Arial" w:hAnsi="Arial" w:cs="Arial"/>
+        </w:rPr>
+      </w:pPr>
+    </w:p>
+    <w:p>
+      <w:pPr>
+        <w:rPr>
+          <w:rFonts w:ascii="Arial" w:hAnsi="Arial" w:cs="Arial"/>
+        </w:rPr>
+      </w:pPr>
+    </w:p>
+    <w:p>
+      <w:pPr>
+        <w:rPr>
+          <w:rFonts w:ascii="Arial" w:hAnsi="Arial" w:cs="Arial"/>
+        </w:rPr>
+      </w:pPr>
+    </w:p>
+    <w:p>
+      <w:pPr>
+        <w:pStyle w:val="Ttulo2"/>
+        <w:rPr>
           <w:lang w:val="en-US"/>
         </w:rPr>
       </w:pPr>
-      <w:bookmarkStart w:id="12" w:name="_Toc234107139"/>
-      <w:r>
-        <w:rPr>
-          <w:lang w:val="en-US"/>
-        </w:rPr>
-        <w:t>7.</w:t>
-      </w:r>
-      <w:r>
-        <w:rPr>
-          <w:lang w:val="en-US"/>
-        </w:rPr>
-        <w:t>2</w:t>
-      </w:r>
-      <w:r>
-        <w:rPr>
-          <w:lang w:val="en-US"/>
-        </w:rPr>
-        <w:t xml:space="preserve"> </w:t>
-      </w:r>
-      <w:r>
-        <w:rPr>
-          <w:lang w:val="en-US"/>
-        </w:rPr>
-        <w:t>Features</w:t>
-      </w:r>
-      <w:bookmarkEnd w:id="12"/>
-    </w:p>
-    <w:p>
-      <w:pPr>
-        <w:rPr>
-          <w:lang w:val="en-US"/>
-        </w:rPr>
-      </w:pPr>
-    </w:p>
-    <w:p>
-      <w:pPr>
-        <w:rPr>
-          <w:rFonts w:ascii="Arial" w:hAnsi="Arial" w:cs="Arial"/>
-          <w:lang w:val="es-CR"/>
-        </w:rPr>
-      </w:pPr>
-      <w:proofErr w:type="spellStart"/>
-      <w:r>
-        <w:rPr>
-          <w:rFonts w:ascii="Arial" w:hAnsi="Arial" w:cs="Arial"/>
-          <w:lang w:val="es-CR"/>
-        </w:rPr>
-        <w:t>Feature</w:t>
-      </w:r>
-      <w:proofErr w:type="spellEnd"/>
-      <w:r>
-        <w:rPr>
-          <w:rFonts w:ascii="Arial" w:hAnsi="Arial" w:cs="Arial"/>
-          <w:lang w:val="es-CR"/>
-        </w:rPr>
-        <w:t xml:space="preserve"> 1</w:t>
-      </w:r>
-      <w:r>
-        <w:rPr>
-          <w:rFonts w:ascii="Arial" w:hAnsi="Arial" w:cs="Arial"/>
-          <w:lang w:val="es-CR"/>
-        </w:rPr>
-        <w:t xml:space="preserve"> - </w:t>
-      </w:r>
-      <w:r>
-        <w:rPr>
-          <w:rFonts w:ascii="Arial" w:hAnsi="Arial" w:cs="Arial"/>
-          <w:lang w:val="es-CR"/>
-        </w:rPr>
-        <w:t>Gestión de Usuarios</w:t>
-      </w:r>
-    </w:p>
-    <w:p>
-      <w:pPr>
-        <w:rPr>
-          <w:rFonts w:ascii="Arial" w:hAnsi="Arial" w:cs="Arial"/>
-          <w:lang w:val="es-CR"/>
-        </w:rPr>
-      </w:pPr>
-    </w:p>
-    <w:p>
-      <w:pPr>
-        <w:rPr>
-          <w:rFonts w:ascii="Arial" w:hAnsi="Arial" w:cs="Arial"/>
-          <w:lang w:val="es-CR"/>
-        </w:rPr>
-      </w:pPr>
-      <w:proofErr w:type="spellStart"/>
-      <w:r>
-        <w:rPr>
-          <w:rFonts w:ascii="Arial" w:hAnsi="Arial" w:cs="Arial"/>
-          <w:lang w:val="es-CR"/>
-        </w:rPr>
-        <w:t>Feature</w:t>
-      </w:r>
-      <w:proofErr w:type="spellEnd"/>
-      <w:r>
-        <w:rPr>
-          <w:rFonts w:ascii="Arial" w:hAnsi="Arial" w:cs="Arial"/>
-          <w:lang w:val="es-CR"/>
-        </w:rPr>
-        <w:t xml:space="preserve"> 2</w:t>
-      </w:r>
-      <w:r>
-        <w:rPr>
-          <w:rFonts w:ascii="Arial" w:hAnsi="Arial" w:cs="Arial"/>
-          <w:lang w:val="es-CR"/>
-        </w:rPr>
-        <w:t xml:space="preserve"> - </w:t>
-      </w:r>
-      <w:r>
-        <w:rPr>
-          <w:rFonts w:ascii="Arial" w:hAnsi="Arial" w:cs="Arial"/>
-          <w:lang w:val="es-CR"/>
-        </w:rPr>
-        <w:t>Gestión de Partidos</w:t>
-      </w:r>
-    </w:p>
-    <w:p>
-      <w:pPr>
-        <w:rPr>
-          <w:rFonts w:ascii="Arial" w:hAnsi="Arial" w:cs="Arial"/>
-          <w:lang w:val="es-CR"/>
-        </w:rPr>
-      </w:pPr>
-    </w:p>
-    <w:p>
-      <w:pPr>
-        <w:rPr>
-          <w:rFonts w:ascii="Arial" w:hAnsi="Arial" w:cs="Arial"/>
-          <w:lang w:val="es-CR"/>
-        </w:rPr>
-      </w:pPr>
-      <w:proofErr w:type="spellStart"/>
-      <w:r>
-        <w:rPr>
-          <w:rFonts w:ascii="Arial" w:hAnsi="Arial" w:cs="Arial"/>
-          <w:lang w:val="es-CR"/>
-        </w:rPr>
-        <w:t>Feature</w:t>
-      </w:r>
-      <w:proofErr w:type="spellEnd"/>
-      <w:r>
-        <w:rPr>
-          <w:rFonts w:ascii="Arial" w:hAnsi="Arial" w:cs="Arial"/>
-          <w:lang w:val="es-CR"/>
-        </w:rPr>
-        <w:t xml:space="preserve"> 3</w:t>
-      </w:r>
-      <w:r>
-        <w:rPr>
-          <w:rFonts w:ascii="Arial" w:hAnsi="Arial" w:cs="Arial"/>
-          <w:lang w:val="es-CR"/>
-        </w:rPr>
-        <w:t xml:space="preserve"> - </w:t>
-      </w:r>
-      <w:r>
-        <w:rPr>
-          <w:rFonts w:ascii="Arial" w:hAnsi="Arial" w:cs="Arial"/>
-          <w:lang w:val="es-CR"/>
-        </w:rPr>
-        <w:t>Gestión de Pronósticos</w:t>
-      </w:r>
-    </w:p>
-    <w:p>
-      <w:pPr>
-        <w:rPr>
-          <w:rFonts w:ascii="Arial" w:hAnsi="Arial" w:cs="Arial"/>
-          <w:lang w:val="es-CR"/>
-        </w:rPr>
-      </w:pPr>
-    </w:p>
-    <w:p>
-      <w:pPr>
-        <w:rPr>
-          <w:rFonts w:ascii="Arial" w:hAnsi="Arial" w:cs="Arial"/>
-          <w:lang w:val="es-CR"/>
-        </w:rPr>
-      </w:pPr>
-      <w:proofErr w:type="spellStart"/>
-      <w:r>
-        <w:rPr>
-          <w:rFonts w:ascii="Arial" w:hAnsi="Arial" w:cs="Arial"/>
-          <w:lang w:val="es-CR"/>
-        </w:rPr>
-        <w:t>Feature</w:t>
-      </w:r>
-      <w:proofErr w:type="spellEnd"/>
-      <w:r>
-        <w:rPr>
-          <w:rFonts w:ascii="Arial" w:hAnsi="Arial" w:cs="Arial"/>
-          <w:lang w:val="es-CR"/>
-        </w:rPr>
-        <w:t xml:space="preserve"> 4</w:t>
-      </w:r>
-      <w:r>
-        <w:rPr>
-          <w:rFonts w:ascii="Arial" w:hAnsi="Arial" w:cs="Arial"/>
-          <w:lang w:val="es-CR"/>
-        </w:rPr>
-        <w:t xml:space="preserve"> - </w:t>
-      </w:r>
-      <w:r>
-        <w:rPr>
-          <w:rFonts w:ascii="Arial" w:hAnsi="Arial" w:cs="Arial"/>
-          <w:lang w:val="es-CR"/>
-        </w:rPr>
-        <w:t>Gestión de Quinielas</w:t>
-      </w:r>
-    </w:p>
-    <w:p>
-      <w:pPr>
-        <w:rPr>
-          <w:rFonts w:ascii="Arial" w:hAnsi="Arial" w:cs="Arial"/>
-          <w:lang w:val="es-CR"/>
-        </w:rPr>
-      </w:pPr>
-    </w:p>
-    <w:p>
-      <w:pPr>
-        <w:rPr>
-          <w:rFonts w:ascii="Arial" w:hAnsi="Arial" w:cs="Arial"/>
-          <w:lang w:val="es-CR"/>
-        </w:rPr>
-      </w:pPr>
-      <w:proofErr w:type="spellStart"/>
-      <w:r>
-        <w:rPr>
-          <w:rFonts w:ascii="Arial" w:hAnsi="Arial" w:cs="Arial"/>
-          <w:lang w:val="es-CR"/>
-        </w:rPr>
-        <w:t>Feature</w:t>
-      </w:r>
-      <w:proofErr w:type="spellEnd"/>
-      <w:r>
-        <w:rPr>
-          <w:rFonts w:ascii="Arial" w:hAnsi="Arial" w:cs="Arial"/>
-          <w:lang w:val="es-CR"/>
-        </w:rPr>
-        <w:t xml:space="preserve"> 5</w:t>
-      </w:r>
-      <w:r>
-        <w:rPr>
-          <w:rFonts w:ascii="Arial" w:hAnsi="Arial" w:cs="Arial"/>
-          <w:lang w:val="es-CR"/>
-        </w:rPr>
-        <w:t xml:space="preserve"> - </w:t>
-      </w:r>
-      <w:r>
-        <w:rPr>
-          <w:rFonts w:ascii="Arial" w:hAnsi="Arial" w:cs="Arial"/>
-          <w:lang w:val="es-CR"/>
-        </w:rPr>
-        <w:t>Rankings y Estadísticas</w:t>
-      </w:r>
-    </w:p>
-    <w:p>
-      <w:pPr>
-        <w:rPr>
-          <w:rFonts w:ascii="Arial" w:hAnsi="Arial" w:cs="Arial"/>
-          <w:lang w:val="es-CR"/>
-        </w:rPr>
-      </w:pPr>
-    </w:p>
-    <w:p>
-      <w:pPr>
-        <w:rPr>
-          <w:rFonts w:ascii="Arial" w:hAnsi="Arial" w:cs="Arial"/>
-          <w:lang w:val="es-CR"/>
-        </w:rPr>
-      </w:pPr>
-      <w:proofErr w:type="spellStart"/>
-      <w:r>
-        <w:rPr>
-          <w:rFonts w:ascii="Arial" w:hAnsi="Arial" w:cs="Arial"/>
-          <w:lang w:val="es-CR"/>
-        </w:rPr>
-        <w:t>Feature</w:t>
-      </w:r>
-      <w:proofErr w:type="spellEnd"/>
-      <w:r>
-        <w:rPr>
-          <w:rFonts w:ascii="Arial" w:hAnsi="Arial" w:cs="Arial"/>
-          <w:lang w:val="es-CR"/>
-        </w:rPr>
-        <w:t xml:space="preserve"> 6</w:t>
-      </w:r>
-      <w:r>
-        <w:rPr>
-          <w:rFonts w:ascii="Arial" w:hAnsi="Arial" w:cs="Arial"/>
-          <w:lang w:val="es-CR"/>
-        </w:rPr>
-        <w:t xml:space="preserve"> - </w:t>
-      </w:r>
-      <w:r>
-        <w:rPr>
-          <w:rFonts w:ascii="Arial" w:hAnsi="Arial" w:cs="Arial"/>
-          <w:lang w:val="es-CR"/>
-        </w:rPr>
-        <w:t>Interfaz y Persistencia de Datos</w:t>
-      </w:r>
-    </w:p>
-    <w:p>
-      <w:pPr>
-        <w:rPr>
-          <w:rFonts w:ascii="Arial" w:hAnsi="Arial" w:cs="Arial"/>
-        </w:rPr>
-      </w:pPr>
-    </w:p>
-    <w:p>
-      <w:pPr>
-        <w:rPr>
-          <w:rFonts w:ascii="Arial" w:hAnsi="Arial" w:cs="Arial"/>
-        </w:rPr>
-      </w:pPr>
-    </w:p>
-    <w:p>
-      <w:pPr>
-        <w:rPr>
-          <w:rFonts w:ascii="Arial" w:hAnsi="Arial" w:cs="Arial"/>
-        </w:rPr>
-      </w:pPr>
-    </w:p>
-    <w:p>
-      <w:pPr>
-        <w:rPr>
-          <w:rFonts w:ascii="Arial" w:hAnsi="Arial" w:cs="Arial"/>
-        </w:rPr>
-      </w:pPr>
-    </w:p>
-    <w:p>
-      <w:pPr>
-        <w:rPr>
-          <w:rFonts w:ascii="Arial" w:hAnsi="Arial" w:cs="Arial"/>
-        </w:rPr>
-      </w:pPr>
-    </w:p>
-    <w:p>
-      <w:pPr>
-        <w:rPr>
-          <w:rFonts w:ascii="Arial" w:hAnsi="Arial" w:cs="Arial"/>
-        </w:rPr>
-      </w:pPr>
-    </w:p>
-    <w:p>
-      <w:pPr>
-        <w:rPr>
-          <w:rFonts w:ascii="Arial" w:hAnsi="Arial" w:cs="Arial"/>
-        </w:rPr>
-      </w:pPr>
-    </w:p>
-    <w:p>
-      <w:pPr>
-        <w:rPr>
-          <w:rFonts w:ascii="Arial" w:hAnsi="Arial" w:cs="Arial"/>
-        </w:rPr>
-      </w:pPr>
-    </w:p>
-    <w:p>
-      <w:pPr>
-        <w:pStyle w:val="Ttulo2"/>
-        <w:rPr>
-          <w:lang w:val="en-US"/>
-        </w:rPr>
-      </w:pPr>
-      <w:bookmarkStart w:id="13" w:name="_Toc234107140"/>
+      <w:bookmarkStart w:id="13" w:name="_Toc236079944"/>
       <w:r>
         <w:rPr>
           <w:lang w:val="en-US"/>
@@ -4898,7 +4857,14 @@
           <w:rFonts w:ascii="Arial" w:hAnsi="Arial" w:cs="Arial"/>
           <w:lang w:val="es-CR"/>
         </w:rPr>
-        <w:t>Crear clase Quiniela</w:t>
+        <w:t xml:space="preserve">Crear clase </w:t>
+      </w:r>
+      <w:r>
+        <w:rPr>
+          <w:rFonts w:ascii="Arial" w:hAnsi="Arial" w:cs="Arial"/>
+          <w:lang w:val="es-CR"/>
+        </w:rPr>
+        <w:t>Pronostico</w:t>
       </w:r>
     </w:p>
     <w:p>
@@ -4918,7 +4884,14 @@
           <w:rFonts w:ascii="Arial" w:hAnsi="Arial" w:cs="Arial"/>
           <w:lang w:val="es-CR"/>
         </w:rPr>
-        <w:t>Crear quiniela</w:t>
+        <w:t xml:space="preserve">Crear </w:t>
+      </w:r>
+      <w:r>
+        <w:rPr>
+          <w:rFonts w:ascii="Arial" w:hAnsi="Arial" w:cs="Arial"/>
+          <w:lang w:val="es-CR"/>
+        </w:rPr>
+        <w:t>pronostico</w:t>
       </w:r>
     </w:p>
     <w:p>
@@ -4958,7 +4931,7 @@
           <w:rFonts w:ascii="Arial" w:hAnsi="Arial" w:cs="Arial"/>
           <w:lang w:val="es-CR"/>
         </w:rPr>
-        <w:t>Mostrar ranking privado</w:t>
+        <w:t xml:space="preserve">Mostrar ranking </w:t>
       </w:r>
     </w:p>
     <w:p>
@@ -5164,7 +5137,7 @@
       <w:pPr>
         <w:pStyle w:val="Ttulo1"/>
       </w:pPr>
-      <w:bookmarkStart w:id="14" w:name="_Toc234107141"/>
+      <w:bookmarkStart w:id="14" w:name="_Toc236079945"/>
       <w:r>
         <w:t>8</w:t>
       </w:r>
@@ -5213,6 +5186,7 @@
       <w:r>
         <w:rPr>
           <w:rFonts w:ascii="Arial" w:hAnsi="Arial" w:cs="Arial"/>
+          <w:noProof/>
           <w:lang w:val="es-CR"/>
         </w:rPr>
         <w:drawing>
@@ -5272,7 +5246,7 @@
       <w:pPr>
         <w:pStyle w:val="Ttulo1"/>
       </w:pPr>
-      <w:bookmarkStart w:id="15" w:name="_Toc234107142"/>
+      <w:bookmarkStart w:id="15" w:name="_Toc236079946"/>
       <w:r>
         <w:lastRenderedPageBreak/>
         <w:t>9</w:t>
@@ -5293,7 +5267,7 @@
           <w:lang w:val="en-US"/>
         </w:rPr>
       </w:pPr>
-      <w:bookmarkStart w:id="16" w:name="_Toc234107143"/>
+      <w:bookmarkStart w:id="16" w:name="_Toc236079947"/>
       <w:r>
         <w:rPr>
           <w:lang w:val="en-US"/>
@@ -5395,6 +5369,7 @@
       <w:r>
         <w:rPr>
           <w:rFonts w:ascii="Arial" w:hAnsi="Arial" w:cs="Arial"/>
+          <w:noProof/>
         </w:rPr>
         <w:drawing>
           <wp:inline distT="0" distB="0" distL="0" distR="0" wp14:anchorId="3107FBF3" wp14:editId="4AF4F136">
@@ -5470,6 +5445,7 @@
       <w:r>
         <w:rPr>
           <w:rFonts w:ascii="Arial" w:hAnsi="Arial" w:cs="Arial"/>
+          <w:noProof/>
         </w:rPr>
         <w:drawing>
           <wp:inline distT="0" distB="0" distL="0" distR="0" wp14:anchorId="287DCE7A" wp14:editId="0F5F0839">
@@ -5552,6 +5528,7 @@
       <w:r>
         <w:rPr>
           <w:rFonts w:ascii="Arial" w:hAnsi="Arial" w:cs="Arial"/>
+          <w:noProof/>
           <w:lang w:val="es-CR"/>
         </w:rPr>
         <w:drawing>
@@ -5595,47 +5572,23 @@
       <w:pPr>
         <w:pStyle w:val="Ttulo2"/>
         <w:rPr>
-          <w:lang w:val="en-US"/>
-        </w:rPr>
-      </w:pPr>
-      <w:bookmarkStart w:id="17" w:name="_Toc234107144"/>
-      <w:r>
-        <w:rPr>
-          <w:lang w:val="en-US"/>
+          <w:lang w:val="es-CR"/>
+        </w:rPr>
+      </w:pPr>
+      <w:bookmarkStart w:id="17" w:name="_Toc236079948"/>
+      <w:r>
+        <w:rPr>
+          <w:lang w:val="es-CR"/>
         </w:rPr>
         <w:lastRenderedPageBreak/>
-        <w:t>9</w:t>
-      </w:r>
-      <w:r>
-        <w:rPr>
-          <w:lang w:val="en-US"/>
-        </w:rPr>
-        <w:t>.</w:t>
-      </w:r>
-      <w:r>
-        <w:rPr>
-          <w:lang w:val="en-US"/>
-        </w:rPr>
-        <w:t>2</w:t>
-      </w:r>
-      <w:r>
-        <w:rPr>
-          <w:lang w:val="en-US"/>
-        </w:rPr>
-        <w:t xml:space="preserve"> </w:t>
-      </w:r>
-      <w:r>
-        <w:rPr>
-          <w:lang w:val="en-US"/>
-        </w:rPr>
-        <w:t>GitHub</w:t>
+        <w:t>9.2 GitHub</w:t>
       </w:r>
       <w:bookmarkEnd w:id="17"/>
     </w:p>
     <w:p>
       <w:pPr>
         <w:rPr>
-          <w:lang w:val="en-US"/>
+          <w:lang w:val="es-CR"/>
         </w:rPr>
       </w:pPr>
     </w:p>
@@ -5721,6 +5674,7 @@
       <w:r>
         <w:rPr>
           <w:rFonts w:ascii="Arial" w:hAnsi="Arial" w:cs="Arial"/>
+          <w:noProof/>
         </w:rPr>
         <w:drawing>
           <wp:inline distT="0" distB="0" distL="0" distR="0" wp14:anchorId="56CC7F0E" wp14:editId="171FB27A">
@@ -5820,6 +5774,7 @@
           <w:rFonts w:ascii="Arial" w:hAnsi="Arial" w:cs="Arial"/>
           <w:b/>
           <w:bCs/>
+          <w:noProof/>
         </w:rPr>
         <w:drawing>
           <wp:inline distT="0" distB="0" distL="0" distR="0" wp14:anchorId="5C2D17D7" wp14:editId="48FC2130">
@@ -5905,7 +5860,7 @@
       <w:pPr>
         <w:pStyle w:val="Ttulo1"/>
       </w:pPr>
-      <w:bookmarkStart w:id="18" w:name="_Toc234107145"/>
+      <w:bookmarkStart w:id="18" w:name="_Toc236079949"/>
       <w:r>
         <w:lastRenderedPageBreak/>
         <w:t>1</w:t>
@@ -6005,7 +5960,7 @@
       <w:pPr>
         <w:pStyle w:val="Ttulo1"/>
       </w:pPr>
-      <w:bookmarkStart w:id="19" w:name="_Toc234107146"/>
+      <w:bookmarkStart w:id="19" w:name="_Toc236079950"/>
       <w:r>
         <w:t>1</w:t>
       </w:r>
@@ -6143,7 +6098,7 @@
 </file>
 
 <file path=word/endnotes.xml><?xml version="1.0" encoding="utf-8"?>
-<w:endnotes xmlns:wpc="http://schemas.microsoft.com/office/word/2010/wordprocessingCanvas" xmlns:cx="http://schemas.microsoft.com/office/drawing/2014/chartex" xmlns:cx1="http://schemas.microsoft.com/office/drawing/2015/9/8/chartex" xmlns:cx2="http://schemas.microsoft.com/office/drawing/2015/10/21/chartex" xmlns:cx3="http://schemas.microsoft.com/office/drawing/2016/5/9/chartex" xmlns:cx4="http://schemas.microsoft.com/office/drawing/2016/5/10/chartex" xmlns:cx5="http://schemas.microsoft.com/office/drawing/2016/5/11/chartex" xmlns:cx6="http://schemas.microsoft.com/office/drawing/2016/5/12/chartex" xmlns:cx7="http://schemas.microsoft.com/office/drawing/2016/5/13/chartex" xmlns:cx8="http://schemas.microsoft.com/office/drawing/2016/5/14/chartex" xmlns:mc="http://schemas.openxmlformats.org/markup-compatibility/2006" xmlns:aink="http://schemas.microsoft.com/office/drawing/2016/ink" xmlns:am3d="http://schemas.microsoft.com/office/drawing/2017/model3d" xmlns:o="urn:schemas-microsoft-com:office:office" xmlns:oel="http://schemas.microsoft.com/office/2019/extlst" xmlns:r="http://schemas.openxmlformats.org/officeDocument/2006/relationships" xmlns:m="http://schemas.openxmlformats.org/officeDocument/2006/math" xmlns:v="urn:schemas-microsoft-com:vml" xmlns:wp14="http://schemas.microsoft.com/office/word/2010/wordprocessingDrawing" xmlns:wp="http://schemas.openxmlformats.org/drawingml/2006/wordprocessingDrawing" xmlns:w10="urn:schemas-microsoft-com:office:word" xmlns:w="http://schemas.openxmlformats.org/wordprocessingml/2006/main" xmlns:w14="http://schemas.microsoft.com/office/word/2010/wordml" xmlns:w15="http://schemas.microsoft.com/office/word/2012/wordml" xmlns:w16cex="http://schemas.microsoft.com/office/word/2018/wordml/cex" xmlns:w16cid="http://schemas.microsoft.com/office/word/2016/wordml/cid" xmlns:w16="http://schemas.microsoft.com/office/word/2018/wordml" xmlns:w16du="http://schemas.microsoft.com/office/word/2023/wordml/word16du" xmlns:w16sdtdh="http://schemas.microsoft.com/office/word/2020/wordml/sdtdatahash" xmlns:w16sdtfl="http://schemas.microsoft.com/office/word/2024/wordml/sdtformatlock" xmlns:w16se="http://schemas.microsoft.com/office/word/2015/wordml/symex" xmlns:wpg="http://schemas.microsoft.com/office/word/2010/wordprocessingGroup" xmlns:wpi="http://schemas.microsoft.com/office/word/2010/wordprocessingInk" xmlns:wne="http://schemas.microsoft.com/office/word/2006/wordml" xmlns:wps="http://schemas.microsoft.com/office/word/2010/wordprocessingShape" mc:Ignorable="w14 w15 w16se w16cid w16 w16cex w16sdtdh w16sdtfl w16du wp14">
+<w:endnotes xmlns:wpc="http://schemas.microsoft.com/office/word/2010/wordprocessingCanvas" xmlns:cx="http://schemas.microsoft.com/office/drawing/2014/chartex" xmlns:cx1="http://schemas.microsoft.com/office/drawing/2015/9/8/chartex" xmlns:cx2="http://schemas.microsoft.com/office/drawing/2015/10/21/chartex" xmlns:cx3="http://schemas.microsoft.com/office/drawing/2016/5/9/chartex" xmlns:cx4="http://schemas.microsoft.com/office/drawing/2016/5/10/chartex" xmlns:cx5="http://schemas.microsoft.com/office/drawing/2016/5/11/chartex" xmlns:cx6="http://schemas.microsoft.com/office/drawing/2016/5/12/chartex" xmlns:cx7="http://schemas.microsoft.com/office/drawing/2016/5/13/chartex" xmlns:cx8="http://schemas.microsoft.com/office/drawing/2016/5/14/chartex" xmlns:mc="http://schemas.openxmlformats.org/markup-compatibility/2006" xmlns:aink="http://schemas.microsoft.com/office/drawing/2016/ink" xmlns:am3d="http://schemas.microsoft.com/office/drawing/2017/model3d" xmlns:o="urn:schemas-microsoft-com:office:office" xmlns:oel="http://schemas.microsoft.com/office/2019/extlst" xmlns:r="http://schemas.openxmlformats.org/officeDocument/2006/relationships" xmlns:m="http://schemas.openxmlformats.org/officeDocument/2006/math" xmlns:v="urn:schemas-microsoft-com:vml" xmlns:wp14="http://schemas.microsoft.com/office/word/2010/wordprocessingDrawing" xmlns:wp="http://schemas.openxmlformats.org/drawingml/2006/wordprocessingDrawing" xmlns:w10="urn:schemas-microsoft-com:office:word" xmlns:w="http://schemas.openxmlformats.org/wordprocessingml/2006/main" xmlns:w14="http://schemas.microsoft.com/office/word/2010/wordml" xmlns:w15="http://schemas.microsoft.com/office/word/2012/wordml" xmlns:w16cei="http://schemas.microsoft.com/office/word/2026/wordml/cei" xmlns:w16cex="http://schemas.microsoft.com/office/word/2018/wordml/cex" xmlns:w16cid="http://schemas.microsoft.com/office/word/2016/wordml/cid" xmlns:w16="http://schemas.microsoft.com/office/word/2018/wordml" xmlns:w16du="http://schemas.microsoft.com/office/word/2023/wordml/word16du" xmlns:w16sdtdh="http://schemas.microsoft.com/office/word/2020/wordml/sdtdatahash" xmlns:w16sdtfl="http://schemas.microsoft.com/office/word/2024/wordml/sdtformatlock" xmlns:w16se="http://schemas.microsoft.com/office/word/2015/wordml/symex" xmlns:wpg="http://schemas.microsoft.com/office/word/2010/wordprocessingGroup" xmlns:wpi="http://schemas.microsoft.com/office/word/2010/wordprocessingInk" xmlns:wne="http://schemas.microsoft.com/office/word/2006/wordml" xmlns:wps="http://schemas.microsoft.com/office/word/2010/wordprocessingShape" mc:Ignorable="w14 w15 w16se w16cid w16 w16cex w16sdtdh w16sdtfl w16du wp14">
   <w:endnote w:type="separator" w:id="-1">
     <w:p>
       <w:r>
@@ -6162,7 +6117,7 @@
 </file>
 
 <file path=word/footer1.xml><?xml version="1.0" encoding="utf-8"?>
-<w:ftr xmlns:wpc="http://schemas.microsoft.com/office/word/2010/wordprocessingCanvas" xmlns:cx="http://schemas.microsoft.com/office/drawing/2014/chartex" xmlns:cx1="http://schemas.microsoft.com/office/drawing/2015/9/8/chartex" xmlns:cx2="http://schemas.microsoft.com/office/drawing/2015/10/21/chartex" xmlns:cx3="http://schemas.microsoft.com/office/drawing/2016/5/9/chartex" xmlns:cx4="http://schemas.microsoft.com/office/drawing/2016/5/10/chartex" xmlns:cx5="http://schemas.microsoft.com/office/drawing/2016/5/11/chartex" xmlns:cx6="http://schemas.microsoft.com/office/drawing/2016/5/12/chartex" xmlns:cx7="http://schemas.microsoft.com/office/drawing/2016/5/13/chartex" xmlns:cx8="http://schemas.microsoft.com/office/drawing/2016/5/14/chartex" xmlns:mc="http://schemas.openxmlformats.org/markup-compatibility/2006" xmlns:aink="http://schemas.microsoft.com/office/drawing/2016/ink" xmlns:am3d="http://schemas.microsoft.com/office/drawing/2017/model3d" xmlns:o="urn:schemas-microsoft-com:office:office" xmlns:oel="http://schemas.microsoft.com/office/2019/extlst" xmlns:r="http://schemas.openxmlformats.org/officeDocument/2006/relationships" xmlns:m="http://schemas.openxmlformats.org/officeDocument/2006/math" xmlns:v="urn:schemas-microsoft-com:vml" xmlns:wp14="http://schemas.microsoft.com/office/word/2010/wordprocessingDrawing" xmlns:wp="http://schemas.openxmlformats.org/drawingml/2006/wordprocessingDrawing" xmlns:w10="urn:schemas-microsoft-com:office:word" xmlns:w="http://schemas.openxmlformats.org/wordprocessingml/2006/main" xmlns:w14="http://schemas.microsoft.com/office/word/2010/wordml" xmlns:w15="http://schemas.microsoft.com/office/word/2012/wordml" xmlns:w16cex="http://schemas.microsoft.com/office/word/2018/wordml/cex" xmlns:w16cid="http://schemas.microsoft.com/office/word/2016/wordml/cid" xmlns:w16="http://schemas.microsoft.com/office/word/2018/wordml" xmlns:w16du="http://schemas.microsoft.com/office/word/2023/wordml/word16du" xmlns:w16sdtdh="http://schemas.microsoft.com/office/word/2020/wordml/sdtdatahash" xmlns:w16sdtfl="http://schemas.microsoft.com/office/word/2024/wordml/sdtformatlock" xmlns:w16se="http://schemas.microsoft.com/office/word/2015/wordml/symex" xmlns:wpg="http://schemas.microsoft.com/office/word/2010/wordprocessingGroup" xmlns:wpi="http://schemas.microsoft.com/office/word/2010/wordprocessingInk" xmlns:wne="http://schemas.microsoft.com/office/word/2006/wordml" xmlns:wps="http://schemas.microsoft.com/office/word/2010/wordprocessingShape" mc:Ignorable="w14 w15 w16se w16cid w16 w16cex w16sdtdh w16sdtfl w16du wp14">
+<w:ftr xmlns:wpc="http://schemas.microsoft.com/office/word/2010/wordprocessingCanvas" xmlns:cx="http://schemas.microsoft.com/office/drawing/2014/chartex" xmlns:cx1="http://schemas.microsoft.com/office/drawing/2015/9/8/chartex" xmlns:cx2="http://schemas.microsoft.com/office/drawing/2015/10/21/chartex" xmlns:cx3="http://schemas.microsoft.com/office/drawing/2016/5/9/chartex" xmlns:cx4="http://schemas.microsoft.com/office/drawing/2016/5/10/chartex" xmlns:cx5="http://schemas.microsoft.com/office/drawing/2016/5/11/chartex" xmlns:cx6="http://schemas.microsoft.com/office/drawing/2016/5/12/chartex" xmlns:cx7="http://schemas.microsoft.com/office/drawing/2016/5/13/chartex" xmlns:cx8="http://schemas.microsoft.com/office/drawing/2016/5/14/chartex" xmlns:mc="http://schemas.openxmlformats.org/markup-compatibility/2006" xmlns:aink="http://schemas.microsoft.com/office/drawing/2016/ink" xmlns:am3d="http://schemas.microsoft.com/office/drawing/2017/model3d" xmlns:o="urn:schemas-microsoft-com:office:office" xmlns:oel="http://schemas.microsoft.com/office/2019/extlst" xmlns:r="http://schemas.openxmlformats.org/officeDocument/2006/relationships" xmlns:m="http://schemas.openxmlformats.org/officeDocument/2006/math" xmlns:v="urn:schemas-microsoft-com:vml" xmlns:wp14="http://schemas.microsoft.com/office/word/2010/wordprocessingDrawing" xmlns:wp="http://schemas.openxmlformats.org/drawingml/2006/wordprocessingDrawing" xmlns:w10="urn:schemas-microsoft-com:office:word" xmlns:w="http://schemas.openxmlformats.org/wordprocessingml/2006/main" xmlns:w14="http://schemas.microsoft.com/office/word/2010/wordml" xmlns:w15="http://schemas.microsoft.com/office/word/2012/wordml" xmlns:w16cei="http://schemas.microsoft.com/office/word/2026/wordml/cei" xmlns:w16cex="http://schemas.microsoft.com/office/word/2018/wordml/cex" xmlns:w16cid="http://schemas.microsoft.com/office/word/2016/wordml/cid" xmlns:w16="http://schemas.microsoft.com/office/word/2018/wordml" xmlns:w16du="http://schemas.microsoft.com/office/word/2023/wordml/word16du" xmlns:w16sdtdh="http://schemas.microsoft.com/office/word/2020/wordml/sdtdatahash" xmlns:w16sdtfl="http://schemas.microsoft.com/office/word/2024/wordml/sdtformatlock" xmlns:w16se="http://schemas.microsoft.com/office/word/2015/wordml/symex" xmlns:wpg="http://schemas.microsoft.com/office/word/2010/wordprocessingGroup" xmlns:wpi="http://schemas.microsoft.com/office/word/2010/wordprocessingInk" xmlns:wne="http://schemas.microsoft.com/office/word/2006/wordml" xmlns:wps="http://schemas.microsoft.com/office/word/2010/wordprocessingShape" mc:Ignorable="w14 w15 w16se w16cid w16 w16cex w16sdtdh w16sdtfl w16du wp14">
   <w:p>
     <w:pPr>
       <w:pStyle w:val="Piedepgina"/>
@@ -6213,7 +6168,7 @@
 </file>
 
 <file path=word/footer2.xml><?xml version="1.0" encoding="utf-8"?>
-<w:ftr xmlns:wpc="http://schemas.microsoft.com/office/word/2010/wordprocessingCanvas" xmlns:cx="http://schemas.microsoft.com/office/drawing/2014/chartex" xmlns:cx1="http://schemas.microsoft.com/office/drawing/2015/9/8/chartex" xmlns:cx2="http://schemas.microsoft.com/office/drawing/2015/10/21/chartex" xmlns:cx3="http://schemas.microsoft.com/office/drawing/2016/5/9/chartex" xmlns:cx4="http://schemas.microsoft.com/office/drawing/2016/5/10/chartex" xmlns:cx5="http://schemas.microsoft.com/office/drawing/2016/5/11/chartex" xmlns:cx6="http://schemas.microsoft.com/office/drawing/2016/5/12/chartex" xmlns:cx7="http://schemas.microsoft.com/office/drawing/2016/5/13/chartex" xmlns:cx8="http://schemas.microsoft.com/office/drawing/2016/5/14/chartex" xmlns:mc="http://schemas.openxmlformats.org/markup-compatibility/2006" xmlns:aink="http://schemas.microsoft.com/office/drawing/2016/ink" xmlns:am3d="http://schemas.microsoft.com/office/drawing/2017/model3d" xmlns:o="urn:schemas-microsoft-com:office:office" xmlns:oel="http://schemas.microsoft.com/office/2019/extlst" xmlns:r="http://schemas.openxmlformats.org/officeDocument/2006/relationships" xmlns:m="http://schemas.openxmlformats.org/officeDocument/2006/math" xmlns:v="urn:schemas-microsoft-com:vml" xmlns:wp14="http://schemas.microsoft.com/office/word/2010/wordprocessingDrawing" xmlns:wp="http://schemas.openxmlformats.org/drawingml/2006/wordprocessingDrawing" xmlns:w10="urn:schemas-microsoft-com:office:word" xmlns:w="http://schemas.openxmlformats.org/wordprocessingml/2006/main" xmlns:w14="http://schemas.microsoft.com/office/word/2010/wordml" xmlns:w15="http://schemas.microsoft.com/office/word/2012/wordml" xmlns:w16cex="http://schemas.microsoft.com/office/word/2018/wordml/cex" xmlns:w16cid="http://schemas.microsoft.com/office/word/2016/wordml/cid" xmlns:w16="http://schemas.microsoft.com/office/word/2018/wordml" xmlns:w16du="http://schemas.microsoft.com/office/word/2023/wordml/word16du" xmlns:w16sdtdh="http://schemas.microsoft.com/office/word/2020/wordml/sdtdatahash" xmlns:w16sdtfl="http://schemas.microsoft.com/office/word/2024/wordml/sdtformatlock" xmlns:w16se="http://schemas.microsoft.com/office/word/2015/wordml/symex" xmlns:wpg="http://schemas.microsoft.com/office/word/2010/wordprocessingGroup" xmlns:wpi="http://schemas.microsoft.com/office/word/2010/wordprocessingInk" xmlns:wne="http://schemas.microsoft.com/office/word/2006/wordml" xmlns:wps="http://schemas.microsoft.com/office/word/2010/wordprocessingShape" mc:Ignorable="w14 w15 w16se w16cid w16 w16cex w16sdtdh w16sdtfl w16du wp14">
+<w:ftr xmlns:wpc="http://schemas.microsoft.com/office/word/2010/wordprocessingCanvas" xmlns:cx="http://schemas.microsoft.com/office/drawing/2014/chartex" xmlns:cx1="http://schemas.microsoft.com/office/drawing/2015/9/8/chartex" xmlns:cx2="http://schemas.microsoft.com/office/drawing/2015/10/21/chartex" xmlns:cx3="http://schemas.microsoft.com/office/drawing/2016/5/9/chartex" xmlns:cx4="http://schemas.microsoft.com/office/drawing/2016/5/10/chartex" xmlns:cx5="http://schemas.microsoft.com/office/drawing/2016/5/11/chartex" xmlns:cx6="http://schemas.microsoft.com/office/drawing/2016/5/12/chartex" xmlns:cx7="http://schemas.microsoft.com/office/drawing/2016/5/13/chartex" xmlns:cx8="http://schemas.microsoft.com/office/drawing/2016/5/14/chartex" xmlns:mc="http://schemas.openxmlformats.org/markup-compatibility/2006" xmlns:aink="http://schemas.microsoft.com/office/drawing/2016/ink" xmlns:am3d="http://schemas.microsoft.com/office/drawing/2017/model3d" xmlns:o="urn:schemas-microsoft-com:office:office" xmlns:oel="http://schemas.microsoft.com/office/2019/extlst" xmlns:r="http://schemas.openxmlformats.org/officeDocument/2006/relationships" xmlns:m="http://schemas.openxmlformats.org/officeDocument/2006/math" xmlns:v="urn:schemas-microsoft-com:vml" xmlns:wp14="http://schemas.microsoft.com/office/word/2010/wordprocessingDrawing" xmlns:wp="http://schemas.openxmlformats.org/drawingml/2006/wordprocessingDrawing" xmlns:w10="urn:schemas-microsoft-com:office:word" xmlns:w="http://schemas.openxmlformats.org/wordprocessingml/2006/main" xmlns:w14="http://schemas.microsoft.com/office/word/2010/wordml" xmlns:w15="http://schemas.microsoft.com/office/word/2012/wordml" xmlns:w16cei="http://schemas.microsoft.com/office/word/2026/wordml/cei" xmlns:w16cex="http://schemas.microsoft.com/office/word/2018/wordml/cex" xmlns:w16cid="http://schemas.microsoft.com/office/word/2016/wordml/cid" xmlns:w16="http://schemas.microsoft.com/office/word/2018/wordml" xmlns:w16du="http://schemas.microsoft.com/office/word/2023/wordml/word16du" xmlns:w16sdtdh="http://schemas.microsoft.com/office/word/2020/wordml/sdtdatahash" xmlns:w16sdtfl="http://schemas.microsoft.com/office/word/2024/wordml/sdtformatlock" xmlns:w16se="http://schemas.microsoft.com/office/word/2015/wordml/symex" xmlns:wpg="http://schemas.microsoft.com/office/word/2010/wordprocessingGroup" xmlns:wpi="http://schemas.microsoft.com/office/word/2010/wordprocessingInk" xmlns:wne="http://schemas.microsoft.com/office/word/2006/wordml" xmlns:wps="http://schemas.microsoft.com/office/word/2010/wordprocessingShape" mc:Ignorable="w14 w15 w16se w16cid w16 w16cex w16sdtdh w16sdtfl w16du wp14">
   <w:p>
     <w:pPr>
       <w:pStyle w:val="Piedepgina"/>
@@ -6270,7 +6225,7 @@
 </file>
 
 <file path=word/footnotes.xml><?xml version="1.0" encoding="utf-8"?>
-<w:footnotes xmlns:wpc="http://schemas.microsoft.com/office/word/2010/wordprocessingCanvas" xmlns:cx="http://schemas.microsoft.com/office/drawing/2014/chartex" xmlns:cx1="http://schemas.microsoft.com/office/drawing/2015/9/8/chartex" xmlns:cx2="http://schemas.microsoft.com/office/drawing/2015/10/21/chartex" xmlns:cx3="http://schemas.microsoft.com/office/drawing/2016/5/9/chartex" xmlns:cx4="http://schemas.microsoft.com/office/drawing/2016/5/10/chartex" xmlns:cx5="http://schemas.microsoft.com/office/drawing/2016/5/11/chartex" xmlns:cx6="http://schemas.microsoft.com/office/drawing/2016/5/12/chartex" xmlns:cx7="http://schemas.microsoft.com/office/drawing/2016/5/13/chartex" xmlns:cx8="http://schemas.microsoft.com/office/drawing/2016/5/14/chartex" xmlns:mc="http://schemas.openxmlformats.org/markup-compatibility/2006" xmlns:aink="http://schemas.microsoft.com/office/drawing/2016/ink" xmlns:am3d="http://schemas.microsoft.com/office/drawing/2017/model3d" xmlns:o="urn:schemas-microsoft-com:office:office" xmlns:oel="http://schemas.microsoft.com/office/2019/extlst" xmlns:r="http://schemas.openxmlformats.org/officeDocument/2006/relationships" xmlns:m="http://schemas.openxmlformats.org/officeDocument/2006/math" xmlns:v="urn:schemas-microsoft-com:vml" xmlns:wp14="http://schemas.microsoft.com/office/word/2010/wordprocessingDrawing" xmlns:wp="http://schemas.openxmlformats.org/drawingml/2006/wordprocessingDrawing" xmlns:w10="urn:schemas-microsoft-com:office:word" xmlns:w="http://schemas.openxmlformats.org/wordprocessingml/2006/main" xmlns:w14="http://schemas.microsoft.com/office/word/2010/wordml" xmlns:w15="http://schemas.microsoft.com/office/word/2012/wordml" xmlns:w16cex="http://schemas.microsoft.com/office/word/2018/wordml/cex" xmlns:w16cid="http://schemas.microsoft.com/office/word/2016/wordml/cid" xmlns:w16="http://schemas.microsoft.com/office/word/2018/wordml" xmlns:w16du="http://schemas.microsoft.com/office/word/2023/wordml/word16du" xmlns:w16sdtdh="http://schemas.microsoft.com/office/word/2020/wordml/sdtdatahash" xmlns:w16sdtfl="http://schemas.microsoft.com/office/word/2024/wordml/sdtformatlock" xmlns:w16se="http://schemas.microsoft.com/office/word/2015/wordml/symex" xmlns:wpg="http://schemas.microsoft.com/office/word/2010/wordprocessingGroup" xmlns:wpi="http://schemas.microsoft.com/office/word/2010/wordprocessingInk" xmlns:wne="http://schemas.microsoft.com/office/word/2006/wordml" xmlns:wps="http://schemas.microsoft.com/office/word/2010/wordprocessingShape" mc:Ignorable="w14 w15 w16se w16cid w16 w16cex w16sdtdh w16sdtfl w16du wp14">
+<w:footnotes xmlns:wpc="http://schemas.microsoft.com/office/word/2010/wordprocessingCanvas" xmlns:cx="http://schemas.microsoft.com/office/drawing/2014/chartex" xmlns:cx1="http://schemas.microsoft.com/office/drawing/2015/9/8/chartex" xmlns:cx2="http://schemas.microsoft.com/office/drawing/2015/10/21/chartex" xmlns:cx3="http://schemas.microsoft.com/office/drawing/2016/5/9/chartex" xmlns:cx4="http://schemas.microsoft.com/office/drawing/2016/5/10/chartex" xmlns:cx5="http://schemas.microsoft.com/office/drawing/2016/5/11/chartex" xmlns:cx6="http://schemas.microsoft.com/office/drawing/2016/5/12/chartex" xmlns:cx7="http://schemas.microsoft.com/office/drawing/2016/5/13/chartex" xmlns:cx8="http://schemas.microsoft.com/office/drawing/2016/5/14/chartex" xmlns:mc="http://schemas.openxmlformats.org/markup-compatibility/2006" xmlns:aink="http://schemas.microsoft.com/office/drawing/2016/ink" xmlns:am3d="http://schemas.microsoft.com/office/drawing/2017/model3d" xmlns:o="urn:schemas-microsoft-com:office:office" xmlns:oel="http://schemas.microsoft.com/office/2019/extlst" xmlns:r="http://schemas.openxmlformats.org/officeDocument/2006/relationships" xmlns:m="http://schemas.openxmlformats.org/officeDocument/2006/math" xmlns:v="urn:schemas-microsoft-com:vml" xmlns:wp14="http://schemas.microsoft.com/office/word/2010/wordprocessingDrawing" xmlns:wp="http://schemas.openxmlformats.org/drawingml/2006/wordprocessingDrawing" xmlns:w10="urn:schemas-microsoft-com:office:word" xmlns:w="http://schemas.openxmlformats.org/wordprocessingml/2006/main" xmlns:w14="http://schemas.microsoft.com/office/word/2010/wordml" xmlns:w15="http://schemas.microsoft.com/office/word/2012/wordml" xmlns:w16cei="http://schemas.microsoft.com/office/word/2026/wordml/cei" xmlns:w16cex="http://schemas.microsoft.com/office/word/2018/wordml/cex" xmlns:w16cid="http://schemas.microsoft.com/office/word/2016/wordml/cid" xmlns:w16="http://schemas.microsoft.com/office/word/2018/wordml" xmlns:w16du="http://schemas.microsoft.com/office/word/2023/wordml/word16du" xmlns:w16sdtdh="http://schemas.microsoft.com/office/word/2020/wordml/sdtdatahash" xmlns:w16sdtfl="http://schemas.microsoft.com/office/word/2024/wordml/sdtformatlock" xmlns:w16se="http://schemas.microsoft.com/office/word/2015/wordml/symex" xmlns:wpg="http://schemas.microsoft.com/office/word/2010/wordprocessingGroup" xmlns:wpi="http://schemas.microsoft.com/office/word/2010/wordprocessingInk" xmlns:wne="http://schemas.microsoft.com/office/word/2006/wordml" xmlns:wps="http://schemas.microsoft.com/office/word/2010/wordprocessingShape" mc:Ignorable="w14 w15 w16se w16cid w16 w16cex w16sdtdh w16sdtfl w16du wp14">
   <w:footnote w:type="separator" w:id="-1">
     <w:p>
       <w:r>
@@ -6289,7 +6244,7 @@
 </file>
 
 <file path=word/header1.xml><?xml version="1.0" encoding="utf-8"?>
-<w:hdr xmlns:wpc="http://schemas.microsoft.com/office/word/2010/wordprocessingCanvas" xmlns:cx="http://schemas.microsoft.com/office/drawing/2014/chartex" xmlns:cx1="http://schemas.microsoft.com/office/drawing/2015/9/8/chartex" xmlns:cx2="http://schemas.microsoft.com/office/drawing/2015/10/21/chartex" xmlns:cx3="http://schemas.microsoft.com/office/drawing/2016/5/9/chartex" xmlns:cx4="http://schemas.microsoft.com/office/drawing/2016/5/10/chartex" xmlns:cx5="http://schemas.microsoft.com/office/drawing/2016/5/11/chartex" xmlns:cx6="http://schemas.microsoft.com/office/drawing/2016/5/12/chartex" xmlns:cx7="http://schemas.microsoft.com/office/drawing/2016/5/13/chartex" xmlns:cx8="http://schemas.microsoft.com/office/drawing/2016/5/14/chartex" xmlns:mc="http://schemas.openxmlformats.org/markup-compatibility/2006" xmlns:aink="http://schemas.microsoft.com/office/drawing/2016/ink" xmlns:am3d="http://schemas.microsoft.com/office/drawing/2017/model3d" xmlns:o="urn:schemas-microsoft-com:office:office" xmlns:oel="http://schemas.microsoft.com/office/2019/extlst" xmlns:r="http://schemas.openxmlformats.org/officeDocument/2006/relationships" xmlns:m="http://schemas.openxmlformats.org/officeDocument/2006/math" xmlns:v="urn:schemas-microsoft-com:vml" xmlns:wp14="http://schemas.microsoft.com/office/word/2010/wordprocessingDrawing" xmlns:wp="http://schemas.openxmlformats.org/drawingml/2006/wordprocessingDrawing" xmlns:w10="urn:schemas-microsoft-com:office:word" xmlns:w="http://schemas.openxmlformats.org/wordprocessingml/2006/main" xmlns:w14="http://schemas.microsoft.com/office/word/2010/wordml" xmlns:w15="http://schemas.microsoft.com/office/word/2012/wordml" xmlns:w16cex="http://schemas.microsoft.com/office/word/2018/wordml/cex" xmlns:w16cid="http://schemas.microsoft.com/office/word/2016/wordml/cid" xmlns:w16="http://schemas.microsoft.com/office/word/2018/wordml" xmlns:w16du="http://schemas.microsoft.com/office/word/2023/wordml/word16du" xmlns:w16sdtdh="http://schemas.microsoft.com/office/word/2020/wordml/sdtdatahash" xmlns:w16sdtfl="http://schemas.microsoft.com/office/word/2024/wordml/sdtformatlock" xmlns:w16se="http://schemas.microsoft.com/office/word/2015/wordml/symex" xmlns:wpg="http://schemas.microsoft.com/office/word/2010/wordprocessingGroup" xmlns:wpi="http://schemas.microsoft.com/office/word/2010/wordprocessingInk" xmlns:wne="http://schemas.microsoft.com/office/word/2006/wordml" xmlns:wps="http://schemas.microsoft.com/office/word/2010/wordprocessingShape" mc:Ignorable="w14 w15 w16se w16cid w16 w16cex w16sdtdh w16sdtfl w16du wp14">
+<w:hdr xmlns:wpc="http://schemas.microsoft.com/office/word/2010/wordprocessingCanvas" xmlns:cx="http://schemas.microsoft.com/office/drawing/2014/chartex" xmlns:cx1="http://schemas.microsoft.com/office/drawing/2015/9/8/chartex" xmlns:cx2="http://schemas.microsoft.com/office/drawing/2015/10/21/chartex" xmlns:cx3="http://schemas.microsoft.com/office/drawing/2016/5/9/chartex" xmlns:cx4="http://schemas.microsoft.com/office/drawing/2016/5/10/chartex" xmlns:cx5="http://schemas.microsoft.com/office/drawing/2016/5/11/chartex" xmlns:cx6="http://schemas.microsoft.com/office/drawing/2016/5/12/chartex" xmlns:cx7="http://schemas.microsoft.com/office/drawing/2016/5/13/chartex" xmlns:cx8="http://schemas.microsoft.com/office/drawing/2016/5/14/chartex" xmlns:mc="http://schemas.openxmlformats.org/markup-compatibility/2006" xmlns:aink="http://schemas.microsoft.com/office/drawing/2016/ink" xmlns:am3d="http://schemas.microsoft.com/office/drawing/2017/model3d" xmlns:o="urn:schemas-microsoft-com:office:office" xmlns:oel="http://schemas.microsoft.com/office/2019/extlst" xmlns:r="http://schemas.openxmlformats.org/officeDocument/2006/relationships" xmlns:m="http://schemas.openxmlformats.org/officeDocument/2006/math" xmlns:v="urn:schemas-microsoft-com:vml" xmlns:wp14="http://schemas.microsoft.com/office/word/2010/wordprocessingDrawing" xmlns:wp="http://schemas.openxmlformats.org/drawingml/2006/wordprocessingDrawing" xmlns:w10="urn:schemas-microsoft-com:office:word" xmlns:w="http://schemas.openxmlformats.org/wordprocessingml/2006/main" xmlns:w14="http://schemas.microsoft.com/office/word/2010/wordml" xmlns:w15="http://schemas.microsoft.com/office/word/2012/wordml" xmlns:w16cei="http://schemas.microsoft.com/office/word/2026/wordml/cei" xmlns:w16cex="http://schemas.microsoft.com/office/word/2018/wordml/cex" xmlns:w16cid="http://schemas.microsoft.com/office/word/2016/wordml/cid" xmlns:w16="http://schemas.microsoft.com/office/word/2018/wordml" xmlns:w16du="http://schemas.microsoft.com/office/word/2023/wordml/word16du" xmlns:w16sdtdh="http://schemas.microsoft.com/office/word/2020/wordml/sdtdatahash" xmlns:w16sdtfl="http://schemas.microsoft.com/office/word/2024/wordml/sdtformatlock" xmlns:w16se="http://schemas.microsoft.com/office/word/2015/wordml/symex" xmlns:wpg="http://schemas.microsoft.com/office/word/2010/wordprocessingGroup" xmlns:wpi="http://schemas.microsoft.com/office/word/2010/wordprocessingInk" xmlns:wne="http://schemas.microsoft.com/office/word/2006/wordml" xmlns:wps="http://schemas.microsoft.com/office/word/2010/wordprocessingShape" mc:Ignorable="w14 w15 w16se w16cid w16 w16cex w16sdtdh w16sdtfl w16du wp14">
   <w:p>
     <w:pPr>
       <w:pStyle w:val="Encabezado"/>
@@ -6442,7 +6397,7 @@
 </file>
 
 <file path=word/numbering.xml><?xml version="1.0" encoding="utf-8"?>
-<w:numbering xmlns:wpc="http://schemas.microsoft.com/office/word/2010/wordprocessingCanvas" xmlns:cx="http://schemas.microsoft.com/office/drawing/2014/chartex" xmlns:cx1="http://schemas.microsoft.com/office/drawing/2015/9/8/chartex" xmlns:cx2="http://schemas.microsoft.com/office/drawing/2015/10/21/chartex" xmlns:cx3="http://schemas.microsoft.com/office/drawing/2016/5/9/chartex" xmlns:cx4="http://schemas.microsoft.com/office/drawing/2016/5/10/chartex" xmlns:cx5="http://schemas.microsoft.com/office/drawing/2016/5/11/chartex" xmlns:cx6="http://schemas.microsoft.com/office/drawing/2016/5/12/chartex" xmlns:cx7="http://schemas.microsoft.com/office/drawing/2016/5/13/chartex" xmlns:cx8="http://schemas.microsoft.com/office/drawing/2016/5/14/chartex" xmlns:mc="http://schemas.openxmlformats.org/markup-compatibility/2006" xmlns:aink="http://schemas.microsoft.com/office/drawing/2016/ink" xmlns:am3d="http://schemas.microsoft.com/office/drawing/2017/model3d" xmlns:o="urn:schemas-microsoft-com:office:office" xmlns:oel="http://schemas.microsoft.com/office/2019/extlst" xmlns:r="http://schemas.openxmlformats.org/officeDocument/2006/relationships" xmlns:m="http://schemas.openxmlformats.org/officeDocument/2006/math" xmlns:v="urn:schemas-microsoft-com:vml" xmlns:wp14="http://schemas.microsoft.com/office/word/2010/wordprocessingDrawing" xmlns:wp="http://schemas.openxmlformats.org/drawingml/2006/wordprocessingDrawing" xmlns:w10="urn:schemas-microsoft-com:office:word" xmlns:w="http://schemas.openxmlformats.org/wordprocessingml/2006/main" xmlns:w14="http://schemas.microsoft.com/office/word/2010/wordml" xmlns:w15="http://schemas.microsoft.com/office/word/2012/wordml" xmlns:w16cex="http://schemas.microsoft.com/office/word/2018/wordml/cex" xmlns:w16cid="http://schemas.microsoft.com/office/word/2016/wordml/cid" xmlns:w16="http://schemas.microsoft.com/office/word/2018/wordml" xmlns:w16du="http://schemas.microsoft.com/office/word/2023/wordml/word16du" xmlns:w16sdtdh="http://schemas.microsoft.com/office/word/2020/wordml/sdtdatahash" xmlns:w16sdtfl="http://schemas.microsoft.com/office/word/2024/wordml/sdtformatlock" xmlns:w16se="http://schemas.microsoft.com/office/word/2015/wordml/symex" xmlns:wpg="http://schemas.microsoft.com/office/word/2010/wordprocessingGroup" xmlns:wpi="http://schemas.microsoft.com/office/word/2010/wordprocessingInk" xmlns:wne="http://schemas.microsoft.com/office/word/2006/wordml" xmlns:wps="http://schemas.microsoft.com/office/word/2010/wordprocessingShape" mc:Ignorable="w14 w15 w16se w16cid w16 w16cex w16sdtdh w16sdtfl w16du wp14">
+<w:numbering xmlns:wpc="http://schemas.microsoft.com/office/word/2010/wordprocessingCanvas" xmlns:cx="http://schemas.microsoft.com/office/drawing/2014/chartex" xmlns:cx1="http://schemas.microsoft.com/office/drawing/2015/9/8/chartex" xmlns:cx2="http://schemas.microsoft.com/office/drawing/2015/10/21/chartex" xmlns:cx3="http://schemas.microsoft.com/office/drawing/2016/5/9/chartex" xmlns:cx4="http://schemas.microsoft.com/office/drawing/2016/5/10/chartex" xmlns:cx5="http://schemas.microsoft.com/office/drawing/2016/5/11/chartex" xmlns:cx6="http://schemas.microsoft.com/office/drawing/2016/5/12/chartex" xmlns:cx7="http://schemas.microsoft.com/office/drawing/2016/5/13/chartex" xmlns:cx8="http://schemas.microsoft.com/office/drawing/2016/5/14/chartex" xmlns:mc="http://schemas.openxmlformats.org/markup-compatibility/2006" xmlns:aink="http://schemas.microsoft.com/office/drawing/2016/ink" xmlns:am3d="http://schemas.microsoft.com/office/drawing/2017/model3d" xmlns:o="urn:schemas-microsoft-com:office:office" xmlns:oel="http://schemas.microsoft.com/office/2019/extlst" xmlns:r="http://schemas.openxmlformats.org/officeDocument/2006/relationships" xmlns:m="http://schemas.openxmlformats.org/officeDocument/2006/math" xmlns:v="urn:schemas-microsoft-com:vml" xmlns:wp14="http://schemas.microsoft.com/office/word/2010/wordprocessingDrawing" xmlns:wp="http://schemas.openxmlformats.org/drawingml/2006/wordprocessingDrawing" xmlns:w10="urn:schemas-microsoft-com:office:word" xmlns:w="http://schemas.openxmlformats.org/wordprocessingml/2006/main" xmlns:w14="http://schemas.microsoft.com/office/word/2010/wordml" xmlns:w15="http://schemas.microsoft.com/office/word/2012/wordml" xmlns:w16cei="http://schemas.microsoft.com/office/word/2026/wordml/cei" xmlns:w16cex="http://schemas.microsoft.com/office/word/2018/wordml/cex" xmlns:w16cid="http://schemas.microsoft.com/office/word/2016/wordml/cid" xmlns:w16="http://schemas.microsoft.com/office/word/2018/wordml" xmlns:w16du="http://schemas.microsoft.com/office/word/2023/wordml/word16du" xmlns:w16sdtdh="http://schemas.microsoft.com/office/word/2020/wordml/sdtdatahash" xmlns:w16sdtfl="http://schemas.microsoft.com/office/word/2024/wordml/sdtformatlock" xmlns:w16se="http://schemas.microsoft.com/office/word/2015/wordml/symex" xmlns:wpg="http://schemas.microsoft.com/office/word/2010/wordprocessingGroup" xmlns:wpi="http://schemas.microsoft.com/office/word/2010/wordprocessingInk" xmlns:wne="http://schemas.microsoft.com/office/word/2006/wordml" xmlns:wps="http://schemas.microsoft.com/office/word/2010/wordprocessingShape" mc:Ignorable="w14 w15 w16se w16cid w16 w16cex w16sdtdh w16sdtfl w16du wp14">
   <w:abstractNum w:abstractNumId="0" w15:restartNumberingAfterBreak="0">
     <w:nsid w:val="05E96C35"/>
     <w:multiLevelType w:val="hybridMultilevel"/>
@@ -8148,6 +8103,7 @@
   <w:style w:type="character" w:default="1" w:styleId="Fuentedeprrafopredeter">
     <w:name w:val="Default Paragraph Font"/>
     <w:uiPriority w:val="1"/>
+    <w:semiHidden/>
     <w:unhideWhenUsed/>
   </w:style>
   <w:style w:type="table" w:default="1" w:styleId="Tablanormal">
@@ -12509,6 +12465,10 @@
 </file>
 
 <file path=customXml/item1.xml><?xml version="1.0" encoding="utf-8"?>
+<b:Sources xmlns:b="http://schemas.openxmlformats.org/officeDocument/2006/bibliography" xmlns="http://schemas.openxmlformats.org/officeDocument/2006/bibliography" SelectedStyle="\APASixthEditionOfficeOnline.xsl" StyleName="APA" Version="6"/>
+</file>
+
+<file path=customXml/item2.xml><?xml version="1.0" encoding="utf-8"?>
 <ct:contentTypeSchema xmlns:ct="http://schemas.microsoft.com/office/2006/metadata/contentType" xmlns:ma="http://schemas.microsoft.com/office/2006/metadata/properties/metaAttributes" ct:_="" ma:_="" ma:contentTypeName="Documento" ma:contentTypeID="0x010100B1C2106573719E479FA23B320D7CCC7E" ma:contentTypeVersion="7" ma:contentTypeDescription="Crear nuevo documento." ma:contentTypeScope="" ma:versionID="9ae72f7ad126c994ca0a6f3078c8084a">
   <xsd:schema xmlns:xsd="http://www.w3.org/2001/XMLSchema" xmlns:xs="http://www.w3.org/2001/XMLSchema" xmlns:p="http://schemas.microsoft.com/office/2006/metadata/properties" xmlns:ns2="0d441547-be56-4a14-8f3f-89f76f8aeaeb" targetNamespace="http://schemas.microsoft.com/office/2006/metadata/properties" ma:root="true" ma:fieldsID="c549a8546070420d2ff3d531eca8a65c" ns2:_="">
     <xsd:import namespace="0d441547-be56-4a14-8f3f-89f76f8aeaeb"/>
@@ -12670,17 +12630,7 @@
 </ct:contentTypeSchema>
 </file>
 
-<file path=customXml/item2.xml><?xml version="1.0" encoding="utf-8"?>
-<b:Sources xmlns:b="http://schemas.openxmlformats.org/officeDocument/2006/bibliography" xmlns="http://schemas.openxmlformats.org/officeDocument/2006/bibliography" SelectedStyle="\APASixthEditionOfficeOnline.xsl" StyleName="APA" Version="6"/>
-</file>
-
 <file path=customXml/item3.xml><?xml version="1.0" encoding="utf-8"?>
-<p:properties xmlns:p="http://schemas.microsoft.com/office/2006/metadata/properties" xmlns:xsi="http://www.w3.org/2001/XMLSchema-instance" xmlns:pc="http://schemas.microsoft.com/office/infopath/2007/PartnerControls">
-  <documentManagement/>
-</p:properties>
-</file>
-
-<file path=customXml/item4.xml><?xml version="1.0" encoding="utf-8"?>
 <?mso-contentType ?>
 <FormTemplates xmlns="http://schemas.microsoft.com/sharepoint/v3/contenttype/forms">
   <Display>DocumentLibraryForm</Display>
@@ -12689,7 +12639,21 @@
 </FormTemplates>
 </file>
 
+<file path=customXml/item4.xml><?xml version="1.0" encoding="utf-8"?>
+<p:properties xmlns:p="http://schemas.microsoft.com/office/2006/metadata/properties" xmlns:xsi="http://www.w3.org/2001/XMLSchema-instance" xmlns:pc="http://schemas.microsoft.com/office/infopath/2007/PartnerControls">
+  <documentManagement/>
+</p:properties>
+</file>
+
 <file path=customXml/itemProps1.xml><?xml version="1.0" encoding="utf-8"?>
+<ds:datastoreItem xmlns:ds="http://schemas.openxmlformats.org/officeDocument/2006/customXml" ds:itemID="{A51CD13C-C53E-46A2-A762-466581D14AAB}">
+  <ds:schemaRefs>
+    <ds:schemaRef ds:uri="http://schemas.openxmlformats.org/officeDocument/2006/bibliography"/>
+  </ds:schemaRefs>
+</ds:datastoreItem>
+</file>
+
+<file path=customXml/itemProps2.xml><?xml version="1.0" encoding="utf-8"?>
 <ds:datastoreItem xmlns:ds="http://schemas.openxmlformats.org/officeDocument/2006/customXml" ds:itemID="{3734EB1F-0F70-4594-90CF-1B9BF752967C}">
   <ds:schemaRefs>
     <ds:schemaRef ds:uri="http://schemas.microsoft.com/office/2006/metadata/contentType"/>
@@ -12707,27 +12671,19 @@
 </ds:datastoreItem>
 </file>
 
-<file path=customXml/itemProps2.xml><?xml version="1.0" encoding="utf-8"?>
-<ds:datastoreItem xmlns:ds="http://schemas.openxmlformats.org/officeDocument/2006/customXml" ds:itemID="{A51CD13C-C53E-46A2-A762-466581D14AAB}">
+<file path=customXml/itemProps3.xml><?xml version="1.0" encoding="utf-8"?>
+<ds:datastoreItem xmlns:ds="http://schemas.openxmlformats.org/officeDocument/2006/customXml" ds:itemID="{EC7D6531-D2EF-43CB-BB17-631AA3DA0CA4}">
   <ds:schemaRefs>
-    <ds:schemaRef ds:uri="http://schemas.openxmlformats.org/officeDocument/2006/bibliography"/>
+    <ds:schemaRef ds:uri="http://schemas.microsoft.com/sharepoint/v3/contenttype/forms"/>
   </ds:schemaRefs>
 </ds:datastoreItem>
 </file>
 
-<file path=customXml/itemProps3.xml><?xml version="1.0" encoding="utf-8"?>
+<file path=customXml/itemProps4.xml><?xml version="1.0" encoding="utf-8"?>
 <ds:datastoreItem xmlns:ds="http://schemas.openxmlformats.org/officeDocument/2006/customXml" ds:itemID="{6A62E3B3-8232-45B8-B005-371BC9FF825D}">
   <ds:schemaRefs>
     <ds:schemaRef ds:uri="http://schemas.microsoft.com/office/2006/metadata/properties"/>
     <ds:schemaRef ds:uri="http://schemas.microsoft.com/office/infopath/2007/PartnerControls"/>
   </ds:schemaRefs>
 </ds:datastoreItem>
-</file>
-
-<file path=customXml/itemProps4.xml><?xml version="1.0" encoding="utf-8"?>
-<ds:datastoreItem xmlns:ds="http://schemas.openxmlformats.org/officeDocument/2006/customXml" ds:itemID="{EC7D6531-D2EF-43CB-BB17-631AA3DA0CA4}">
-  <ds:schemaRefs>
-    <ds:schemaRef ds:uri="http://schemas.microsoft.com/sharepoint/v3/contenttype/forms"/>
-  </ds:schemaRefs>
-</ds:datastoreItem>
 </file>
</xml_diff>